<commit_message>
Update report and defense deck screenshots
</commit_message>
<xml_diff>
--- a/project_docs/Eve_Full_Project_Report_Draft.docx
+++ b/project_docs/Eve_Full_Project_Report_Draft.docx
@@ -1,6 +1,6 @@
 
 <file path=word/document.xml><?xml version="1.0" encoding="utf-8"?>
-<w:document xmlns:w="http://schemas.openxmlformats.org/wordprocessingml/2006/main">
+<w:document xmlns:w="http://schemas.openxmlformats.org/wordprocessingml/2006/main" xmlns:r="http://schemas.openxmlformats.org/officeDocument/2006/relationships" xmlns:wp="http://schemas.openxmlformats.org/drawingml/2006/wordprocessingDrawing" xmlns:a="http://schemas.openxmlformats.org/drawingml/2006/main" xmlns:pic="http://schemas.openxmlformats.org/drawingml/2006/picture">
   <w:body>
     <w:p>
       <w:pPr>
@@ -366,7 +366,7 @@
           <w:rFonts w:ascii="Times New Roman" w:hAnsi="Times New Roman"/>
           <w:sz w:val="24"/>
         </w:rPr>
-        <w:t xml:space="preserve">This project focused on the design and implementation of an AI system for personalized learning and academic progress tracking. The system, named Eve, was developed as a role-aware academic companion for Edo State University Iyamho. It supports guest users, students, and lecturers through a responsive Flutter interface connected to a Python FastAPI backend. The system provides admission guidance, student learning progress tracking, guided learning sessions, quiz scoring, saved progress history, lecturer assigned-course analytics, Retrieval-Augmented Generation, prompt-injection guardrails, and optional OpenAI response generation. SQLite was used to persist learning sessions, answers, scores, feedback, and completion status. The system was evaluated using backend compilation, Flutter analysis, widget tests, API endpoint tests, learning-session persistence checks, lecturer analytics checks, and security behavior tests. The results showed that Eve can support personalized academic guidance, track student progress over time, and provide lecturers with course-level learning evidence while enforcing role-based privacy controls.</w:t>
+        <w:t xml:space="preserve">This project focused on the design and implementation of an AI system for personalized learning and academic progress tracking. The system, named Eve, was developed as a role-aware academic companion for Edo State University Iyamho. It supports guest users, students, and lecturers through a responsive Flutter interface connected to a Python FastAPI backend. The system provides admission guidance, student learning progress tracking, guided learning sessions, quiz scoring, saved progress history, upload-assisted questions, moderated peer notes, lecturer assigned-course analytics, Retrieval-Augmented Generation, prompt-injection guardrails, knowledge governance, and optional OpenAI response generation. SQLite was used to persist learning sessions, answers, scores, feedback, completion status, and peer-note review records. The system was evaluated using backend compilation, Flutter analysis, widget tests, API endpoint tests, learning-session persistence checks, lecturer analytics checks, moderation checks, and security behavior tests. The results showed that Eve can support personalized academic guidance, track student progress over time, manage reviewed student contributions, and provide lecturers with course-level learning evidence while enforcing role-based privacy controls.</w:t>
       </w:r>
     </w:p>
     <w:p/>
@@ -424,77 +424,107 @@
           <w:rFonts w:ascii="Times New Roman" w:hAnsi="Times New Roman"/>
           <w:sz w:val="24"/>
         </w:rPr>
-        <w:t xml:space="preserve">Figure 4.2 Student home screen</w:t>
-      </w:r>
-    </w:p>
-    <w:p/>
-    <w:p>
-      <w:r>
-        <w:rPr>
-          <w:rFonts w:ascii="Times New Roman" w:hAnsi="Times New Roman"/>
-          <w:sz w:val="24"/>
-        </w:rPr>
-        <w:t xml:space="preserve">Figure 4.3 Chat interface</w:t>
-      </w:r>
-    </w:p>
-    <w:p/>
-    <w:p>
-      <w:r>
-        <w:rPr>
-          <w:rFonts w:ascii="Times New Roman" w:hAnsi="Times New Roman"/>
-          <w:sz w:val="24"/>
-        </w:rPr>
-        <w:t xml:space="preserve">Figure 4.4 Student learning progress dashboard</w:t>
-      </w:r>
-    </w:p>
-    <w:p/>
-    <w:p>
-      <w:r>
-        <w:rPr>
-          <w:rFonts w:ascii="Times New Roman" w:hAnsi="Times New Roman"/>
-          <w:sz w:val="24"/>
-        </w:rPr>
-        <w:t xml:space="preserve">Figure 4.5 Guided learning session screen</w:t>
-      </w:r>
-    </w:p>
-    <w:p/>
-    <w:p>
-      <w:r>
-        <w:rPr>
-          <w:rFonts w:ascii="Times New Roman" w:hAnsi="Times New Roman"/>
-          <w:sz w:val="24"/>
-        </w:rPr>
-        <w:t xml:space="preserve">Figure 4.6 Feedback history screen</w:t>
-      </w:r>
-    </w:p>
-    <w:p/>
-    <w:p>
-      <w:r>
-        <w:rPr>
-          <w:rFonts w:ascii="Times New Roman" w:hAnsi="Times New Roman"/>
-          <w:sz w:val="24"/>
-        </w:rPr>
-        <w:t xml:space="preserve">Figure 4.7 Lecturer teaching workbench</w:t>
-      </w:r>
-    </w:p>
-    <w:p/>
-    <w:p>
-      <w:r>
-        <w:rPr>
-          <w:rFonts w:ascii="Times New Roman" w:hAnsi="Times New Roman"/>
-          <w:sz w:val="24"/>
-        </w:rPr>
-        <w:t xml:space="preserve">Figure 4.8 Admission readiness estimator</w:t>
-      </w:r>
-    </w:p>
-    <w:p/>
-    <w:p>
-      <w:r>
-        <w:rPr>
-          <w:rFonts w:ascii="Times New Roman" w:hAnsi="Times New Roman"/>
-          <w:sz w:val="24"/>
-        </w:rPr>
-        <w:t xml:space="preserve">Figure 4.9 Profile/account switcher</w:t>
+        <w:t xml:space="preserve">Figure 4.2 Personalized student dashboard</w:t>
+      </w:r>
+    </w:p>
+    <w:p/>
+    <w:p>
+      <w:r>
+        <w:rPr>
+          <w:rFonts w:ascii="Times New Roman" w:hAnsi="Times New Roman"/>
+          <w:sz w:val="24"/>
+        </w:rPr>
+        <w:t xml:space="preserve">Figure 4.3 Mobile responsive dashboard</w:t>
+      </w:r>
+    </w:p>
+    <w:p/>
+    <w:p>
+      <w:r>
+        <w:rPr>
+          <w:rFonts w:ascii="Times New Roman" w:hAnsi="Times New Roman"/>
+          <w:sz w:val="24"/>
+        </w:rPr>
+        <w:t xml:space="preserve">Figure 4.4 Ask Eve conversation</w:t>
+      </w:r>
+    </w:p>
+    <w:p/>
+    <w:p>
+      <w:r>
+        <w:rPr>
+          <w:rFonts w:ascii="Times New Roman" w:hAnsi="Times New Roman"/>
+          <w:sz w:val="24"/>
+        </w:rPr>
+        <w:t xml:space="preserve">Figure 4.5 Upload-assisted Ask Eve</w:t>
+      </w:r>
+    </w:p>
+    <w:p/>
+    <w:p>
+      <w:r>
+        <w:rPr>
+          <w:rFonts w:ascii="Times New Roman" w:hAnsi="Times New Roman"/>
+          <w:sz w:val="24"/>
+        </w:rPr>
+        <w:t xml:space="preserve">Figure 4.6 Guided learning session</w:t>
+      </w:r>
+    </w:p>
+    <w:p/>
+    <w:p>
+      <w:r>
+        <w:rPr>
+          <w:rFonts w:ascii="Times New Roman" w:hAnsi="Times New Roman"/>
+          <w:sz w:val="24"/>
+        </w:rPr>
+        <w:t xml:space="preserve">Figure 4.7 Peer-note submission</w:t>
+      </w:r>
+    </w:p>
+    <w:p/>
+    <w:p>
+      <w:r>
+        <w:rPr>
+          <w:rFonts w:ascii="Times New Roman" w:hAnsi="Times New Roman"/>
+          <w:sz w:val="24"/>
+        </w:rPr>
+        <w:t xml:space="preserve">Figure 4.8 Lecturer peer-note review</w:t>
+      </w:r>
+    </w:p>
+    <w:p/>
+    <w:p>
+      <w:r>
+        <w:rPr>
+          <w:rFonts w:ascii="Times New Roman" w:hAnsi="Times New Roman"/>
+          <w:sz w:val="24"/>
+        </w:rPr>
+        <w:t xml:space="preserve">Figure 4.9 Lecturer analytics</w:t>
+      </w:r>
+    </w:p>
+    <w:p/>
+    <w:p>
+      <w:r>
+        <w:rPr>
+          <w:rFonts w:ascii="Times New Roman" w:hAnsi="Times New Roman"/>
+          <w:sz w:val="24"/>
+        </w:rPr>
+        <w:t xml:space="preserve">Figure 4.10 Admission readiness estimator</w:t>
+      </w:r>
+    </w:p>
+    <w:p/>
+    <w:p>
+      <w:r>
+        <w:rPr>
+          <w:rFonts w:ascii="Times New Roman" w:hAnsi="Times New Roman"/>
+          <w:sz w:val="24"/>
+        </w:rPr>
+        <w:t xml:space="preserve">Figure 4.11 Admin knowledge library</w:t>
+      </w:r>
+    </w:p>
+    <w:p/>
+    <w:p>
+      <w:r>
+        <w:rPr>
+          <w:rFonts w:ascii="Times New Roman" w:hAnsi="Times New Roman"/>
+          <w:sz w:val="24"/>
+        </w:rPr>
+        <w:t xml:space="preserve">Figure 4.12 Backend health endpoint</w:t>
       </w:r>
     </w:p>
     <w:p/>
@@ -3335,6 +3365,33 @@
           <w:rFonts w:ascii="Times New Roman" w:hAnsi="Times New Roman"/>
           <w:sz w:val="24"/>
         </w:rPr>
+        <w:t xml:space="preserve">• upload-assisted Ask Eve questions;</w:t>
+      </w:r>
+    </w:p>
+    <w:p>
+      <w:r>
+        <w:rPr>
+          <w:rFonts w:ascii="Times New Roman" w:hAnsi="Times New Roman"/>
+          <w:sz w:val="24"/>
+        </w:rPr>
+        <w:t xml:space="preserve">• moderated peer-note submissions;</w:t>
+      </w:r>
+    </w:p>
+    <w:p>
+      <w:r>
+        <w:rPr>
+          <w:rFonts w:ascii="Times New Roman" w:hAnsi="Times New Roman"/>
+          <w:sz w:val="24"/>
+        </w:rPr>
+        <w:t xml:space="preserve">• lecturer and admin review workflow;</w:t>
+      </w:r>
+    </w:p>
+    <w:p>
+      <w:r>
+        <w:rPr>
+          <w:rFonts w:ascii="Times New Roman" w:hAnsi="Times New Roman"/>
+          <w:sz w:val="24"/>
+        </w:rPr>
         <w:t xml:space="preserve">• defense-ready audit and explainability labels.</w:t>
       </w:r>
     </w:p>
@@ -3482,6 +3539,42 @@
           <w:rFonts w:ascii="Times New Roman" w:hAnsi="Times New Roman"/>
           <w:sz w:val="24"/>
         </w:rPr>
+        <w:t xml:space="preserve">• allow students to upload notes for private question context;</w:t>
+      </w:r>
+    </w:p>
+    <w:p>
+      <w:r>
+        <w:rPr>
+          <w:rFonts w:ascii="Times New Roman" w:hAnsi="Times New Roman"/>
+          <w:sz w:val="24"/>
+        </w:rPr>
+        <w:t xml:space="preserve">• allow students to submit course notes for review;</w:t>
+      </w:r>
+    </w:p>
+    <w:p>
+      <w:r>
+        <w:rPr>
+          <w:rFonts w:ascii="Times New Roman" w:hAnsi="Times New Roman"/>
+          <w:sz w:val="24"/>
+        </w:rPr>
+        <w:t xml:space="preserve">• allow lecturers to review peer notes only for assigned courses;</w:t>
+      </w:r>
+    </w:p>
+    <w:p>
+      <w:r>
+        <w:rPr>
+          <w:rFonts w:ascii="Times New Roman" w:hAnsi="Times New Roman"/>
+          <w:sz w:val="24"/>
+        </w:rPr>
+        <w:t xml:space="preserve">• allow administrators to manage wider knowledge-base entries;</w:t>
+      </w:r>
+    </w:p>
+    <w:p>
+      <w:r>
+        <w:rPr>
+          <w:rFonts w:ascii="Times New Roman" w:hAnsi="Times New Roman"/>
+          <w:sz w:val="24"/>
+        </w:rPr>
         <w:t xml:space="preserve">• provide lecturers with analytics for assigned courses only;</w:t>
       </w:r>
     </w:p>
@@ -4040,6 +4133,18 @@
           <w:rFonts w:ascii="Times New Roman" w:hAnsi="Times New Roman"/>
           <w:sz w:val="24"/>
         </w:rPr>
+        <w:t xml:space="preserve">Academic --&gt; PeerNotes["Moderated Peer Notes"]</w:t>
+      </w:r>
+    </w:p>
+    <w:p>
+      <w:pPr>
+        <w:pStyle w:val="Code"/>
+      </w:pPr>
+      <w:r>
+        <w:rPr>
+          <w:rFonts w:ascii="Times New Roman" w:hAnsi="Times New Roman"/>
+          <w:sz w:val="24"/>
+        </w:rPr>
         <w:t xml:space="preserve">RAG --&gt; Knowledge["Curated ESUI Knowledge Base"]</w:t>
       </w:r>
     </w:p>
@@ -4052,6 +4157,18 @@
           <w:rFonts w:ascii="Times New Roman" w:hAnsi="Times New Roman"/>
           <w:sz w:val="24"/>
         </w:rPr>
+        <w:t xml:space="preserve">PeerNotes --&gt; RAG</w:t>
+      </w:r>
+    </w:p>
+    <w:p>
+      <w:pPr>
+        <w:pStyle w:val="Code"/>
+      </w:pPr>
+      <w:r>
+        <w:rPr>
+          <w:rFonts w:ascii="Times New Roman" w:hAnsi="Times New Roman"/>
+          <w:sz w:val="24"/>
+        </w:rPr>
         <w:t xml:space="preserve">API --&gt; OpenAI["Optional OpenAI Responses API"]</w:t>
       </w:r>
     </w:p>
@@ -4088,7 +4205,7 @@
           <w:rFonts w:ascii="Times New Roman" w:hAnsi="Times New Roman"/>
           <w:sz w:val="24"/>
         </w:rPr>
-        <w:t xml:space="preserve">The backend is implemented with FastAPI. It exposes REST endpoints for users, chat, admissions estimation, student learning profile, learning sessions, progress history, and lecturer insights.</w:t>
+        <w:t xml:space="preserve">The backend is implemented with FastAPI. It exposes REST endpoints for users, chat, admissions estimation, student learning profile, learning sessions, progress history, lecturer insights, file-assisted questions, peer-note submission, and moderation review.</w:t>
       </w:r>
     </w:p>
     <w:p/>
@@ -4136,7 +4253,7 @@
           <w:rFonts w:ascii="Times New Roman" w:hAnsi="Times New Roman"/>
           <w:sz w:val="24"/>
         </w:rPr>
-        <w:t xml:space="preserve">The prototype uses JSON files for sample users, sample academic records, and curated knowledge. It uses SQLite for saved learning sessions and progress tracking.</w:t>
+        <w:t xml:space="preserve">The prototype uses JSON files for sample users, sample academic records, and curated knowledge. It uses SQLite for saved learning sessions, progress tracking, and moderated peer-note records.</w:t>
       </w:r>
     </w:p>
     <w:p/>
@@ -4338,41 +4455,77 @@
         <w:t xml:space="preserve">Student --&gt; UC9["Ask fee or timetable guidance"]</w:t>
       </w:r>
     </w:p>
-    <w:p/>
-    <w:p>
-      <w:pPr>
-        <w:pStyle w:val="Code"/>
-      </w:pPr>
-      <w:r>
-        <w:rPr>
-          <w:rFonts w:ascii="Times New Roman" w:hAnsi="Times New Roman"/>
-          <w:sz w:val="24"/>
-        </w:rPr>
-        <w:t xml:space="preserve">Lecturer --&gt; UC10["View assigned-course analytics"]</w:t>
-      </w:r>
-    </w:p>
-    <w:p>
-      <w:pPr>
-        <w:pStyle w:val="Code"/>
-      </w:pPr>
-      <w:r>
-        <w:rPr>
-          <w:rFonts w:ascii="Times New Roman" w:hAnsi="Times New Roman"/>
-          <w:sz w:val="24"/>
-        </w:rPr>
-        <w:t xml:space="preserve">Lecturer --&gt; UC11["View saved session trends"]</w:t>
-      </w:r>
-    </w:p>
-    <w:p>
-      <w:pPr>
-        <w:pStyle w:val="Code"/>
-      </w:pPr>
-      <w:r>
-        <w:rPr>
-          <w:rFonts w:ascii="Times New Roman" w:hAnsi="Times New Roman"/>
-          <w:sz w:val="24"/>
-        </w:rPr>
-        <w:t xml:space="preserve">Lecturer --&gt; UC12["Request teaching interventions"]</w:t>
+    <w:p>
+      <w:pPr>
+        <w:pStyle w:val="Code"/>
+      </w:pPr>
+      <w:r>
+        <w:rPr>
+          <w:rFonts w:ascii="Times New Roman" w:hAnsi="Times New Roman"/>
+          <w:sz w:val="24"/>
+        </w:rPr>
+        <w:t xml:space="preserve">Student --&gt; UC10["Upload private notes for Ask Eve"]</w:t>
+      </w:r>
+    </w:p>
+    <w:p>
+      <w:pPr>
+        <w:pStyle w:val="Code"/>
+      </w:pPr>
+      <w:r>
+        <w:rPr>
+          <w:rFonts w:ascii="Times New Roman" w:hAnsi="Times New Roman"/>
+          <w:sz w:val="24"/>
+        </w:rPr>
+        <w:t xml:space="preserve">Student --&gt; UC11["Submit peer learning notes"]</w:t>
+      </w:r>
+    </w:p>
+    <w:p/>
+    <w:p>
+      <w:pPr>
+        <w:pStyle w:val="Code"/>
+      </w:pPr>
+      <w:r>
+        <w:rPr>
+          <w:rFonts w:ascii="Times New Roman" w:hAnsi="Times New Roman"/>
+          <w:sz w:val="24"/>
+        </w:rPr>
+        <w:t xml:space="preserve">Lecturer --&gt; UC12["View assigned-course analytics"]</w:t>
+      </w:r>
+    </w:p>
+    <w:p>
+      <w:pPr>
+        <w:pStyle w:val="Code"/>
+      </w:pPr>
+      <w:r>
+        <w:rPr>
+          <w:rFonts w:ascii="Times New Roman" w:hAnsi="Times New Roman"/>
+          <w:sz w:val="24"/>
+        </w:rPr>
+        <w:t xml:space="preserve">Lecturer --&gt; UC13["View saved session trends"]</w:t>
+      </w:r>
+    </w:p>
+    <w:p>
+      <w:pPr>
+        <w:pStyle w:val="Code"/>
+      </w:pPr>
+      <w:r>
+        <w:rPr>
+          <w:rFonts w:ascii="Times New Roman" w:hAnsi="Times New Roman"/>
+          <w:sz w:val="24"/>
+        </w:rPr>
+        <w:t xml:space="preserve">Lecturer --&gt; UC14["Request teaching interventions"]</w:t>
+      </w:r>
+    </w:p>
+    <w:p>
+      <w:pPr>
+        <w:pStyle w:val="Code"/>
+      </w:pPr>
+      <w:r>
+        <w:rPr>
+          <w:rFonts w:ascii="Times New Roman" w:hAnsi="Times New Roman"/>
+          <w:sz w:val="24"/>
+        </w:rPr>
+        <w:t xml:space="preserve">Lecturer --&gt; UC15["Review assigned-course peer notes"]</w:t>
       </w:r>
     </w:p>
     <w:p/>
@@ -4520,6 +4673,42 @@
         <w:t xml:space="preserve">UC12 --&gt; Eve</w:t>
       </w:r>
     </w:p>
+    <w:p>
+      <w:pPr>
+        <w:pStyle w:val="Code"/>
+      </w:pPr>
+      <w:r>
+        <w:rPr>
+          <w:rFonts w:ascii="Times New Roman" w:hAnsi="Times New Roman"/>
+          <w:sz w:val="24"/>
+        </w:rPr>
+        <w:t xml:space="preserve">UC13 --&gt; Eve</w:t>
+      </w:r>
+    </w:p>
+    <w:p>
+      <w:pPr>
+        <w:pStyle w:val="Code"/>
+      </w:pPr>
+      <w:r>
+        <w:rPr>
+          <w:rFonts w:ascii="Times New Roman" w:hAnsi="Times New Roman"/>
+          <w:sz w:val="24"/>
+        </w:rPr>
+        <w:t xml:space="preserve">UC14 --&gt; Eve</w:t>
+      </w:r>
+    </w:p>
+    <w:p>
+      <w:pPr>
+        <w:pStyle w:val="Code"/>
+      </w:pPr>
+      <w:r>
+        <w:rPr>
+          <w:rFonts w:ascii="Times New Roman" w:hAnsi="Times New Roman"/>
+          <w:sz w:val="24"/>
+        </w:rPr>
+        <w:t xml:space="preserve">UC15 --&gt; Eve</w:t>
+      </w:r>
+    </w:p>
     <w:p/>
     <w:p>
       <w:pPr>
@@ -4640,6 +4829,18 @@
           <w:rFonts w:ascii="Times New Roman" w:hAnsi="Times New Roman"/>
           <w:sz w:val="24"/>
         </w:rPr>
+        <w:t xml:space="preserve">AcademicData --&gt; PeerNotes["Moderated Peer Notes"]</w:t>
+      </w:r>
+    </w:p>
+    <w:p>
+      <w:pPr>
+        <w:pStyle w:val="Code"/>
+      </w:pPr>
+      <w:r>
+        <w:rPr>
+          <w:rFonts w:ascii="Times New Roman" w:hAnsi="Times New Roman"/>
+          <w:sz w:val="24"/>
+        </w:rPr>
         <w:t xml:space="preserve">Retrieval --&gt; Response["AI Response Generation"]</w:t>
       </w:r>
     </w:p>
@@ -4652,6 +4853,18 @@
           <w:rFonts w:ascii="Times New Roman" w:hAnsi="Times New Roman"/>
           <w:sz w:val="24"/>
         </w:rPr>
+        <w:t xml:space="preserve">PeerNotes --&gt; Retrieval</w:t>
+      </w:r>
+    </w:p>
+    <w:p>
+      <w:pPr>
+        <w:pStyle w:val="Code"/>
+      </w:pPr>
+      <w:r>
+        <w:rPr>
+          <w:rFonts w:ascii="Times New Roman" w:hAnsi="Times New Roman"/>
+          <w:sz w:val="24"/>
+        </w:rPr>
         <w:t xml:space="preserve">AcademicData --&gt; Response</w:t>
       </w:r>
     </w:p>
@@ -4884,7 +5097,7 @@
           <w:rFonts w:ascii="Times New Roman" w:hAnsi="Times New Roman"/>
           <w:sz w:val="24"/>
         </w:rPr>
-        <w:t xml:space="preserve">SQLite is used for local persistence of learning-session history. This makes the prototype suitable for defense because progress survives backend restarts without requiring an external database server.</w:t>
+        <w:t xml:space="preserve">SQLite is used for local persistence of learning-session history and moderated peer-note activity. This makes the prototype suitable for defense because progress and contribution records survive backend restarts without requiring an external database server.</w:t>
       </w:r>
     </w:p>
     <w:p/>
@@ -4926,6 +5139,18 @@
         <w:t xml:space="preserve">LEARNING_SESSIONS ||--o{ LEARNING_ANSWERS : contains</w:t>
       </w:r>
     </w:p>
+    <w:p>
+      <w:pPr>
+        <w:pStyle w:val="Code"/>
+      </w:pPr>
+      <w:r>
+        <w:rPr>
+          <w:rFonts w:ascii="Times New Roman" w:hAnsi="Times New Roman"/>
+          <w:sz w:val="24"/>
+        </w:rPr>
+        <w:t xml:space="preserve">PEER_NOTES ||--o{ PEER_NOTE_REVIEWS : receives</w:t>
+      </w:r>
+    </w:p>
     <w:p/>
     <w:p>
       <w:pPr>
@@ -5214,6 +5439,224 @@
           <w:sz w:val="24"/>
         </w:rPr>
         <w:t xml:space="preserve">text ideal_answer</w:t>
+      </w:r>
+    </w:p>
+    <w:p>
+      <w:pPr>
+        <w:pStyle w:val="Code"/>
+      </w:pPr>
+      <w:r>
+        <w:rPr>
+          <w:rFonts w:ascii="Times New Roman" w:hAnsi="Times New Roman"/>
+          <w:sz w:val="24"/>
+        </w:rPr>
+        <w:t xml:space="preserve">text created_at</w:t>
+      </w:r>
+    </w:p>
+    <w:p>
+      <w:pPr>
+        <w:pStyle w:val="Code"/>
+      </w:pPr>
+      <w:r>
+        <w:rPr>
+          <w:rFonts w:ascii="Times New Roman" w:hAnsi="Times New Roman"/>
+          <w:sz w:val="24"/>
+        </w:rPr>
+        <w:t xml:space="preserve">}</w:t>
+      </w:r>
+    </w:p>
+    <w:p/>
+    <w:p>
+      <w:pPr>
+        <w:pStyle w:val="Code"/>
+      </w:pPr>
+      <w:r>
+        <w:rPr>
+          <w:rFonts w:ascii="Times New Roman" w:hAnsi="Times New Roman"/>
+          <w:sz w:val="24"/>
+        </w:rPr>
+        <w:t xml:space="preserve">PEER_NOTES {</w:t>
+      </w:r>
+    </w:p>
+    <w:p>
+      <w:pPr>
+        <w:pStyle w:val="Code"/>
+      </w:pPr>
+      <w:r>
+        <w:rPr>
+          <w:rFonts w:ascii="Times New Roman" w:hAnsi="Times New Roman"/>
+          <w:sz w:val="24"/>
+        </w:rPr>
+        <w:t xml:space="preserve">text note_id PK</w:t>
+      </w:r>
+    </w:p>
+    <w:p>
+      <w:pPr>
+        <w:pStyle w:val="Code"/>
+      </w:pPr>
+      <w:r>
+        <w:rPr>
+          <w:rFonts w:ascii="Times New Roman" w:hAnsi="Times New Roman"/>
+          <w:sz w:val="24"/>
+        </w:rPr>
+        <w:t xml:space="preserve">text user_id</w:t>
+      </w:r>
+    </w:p>
+    <w:p>
+      <w:pPr>
+        <w:pStyle w:val="Code"/>
+      </w:pPr>
+      <w:r>
+        <w:rPr>
+          <w:rFonts w:ascii="Times New Roman" w:hAnsi="Times New Roman"/>
+          <w:sz w:val="24"/>
+        </w:rPr>
+        <w:t xml:space="preserve">text course_code</w:t>
+      </w:r>
+    </w:p>
+    <w:p>
+      <w:pPr>
+        <w:pStyle w:val="Code"/>
+      </w:pPr>
+      <w:r>
+        <w:rPr>
+          <w:rFonts w:ascii="Times New Roman" w:hAnsi="Times New Roman"/>
+          <w:sz w:val="24"/>
+        </w:rPr>
+        <w:t xml:space="preserve">text title</w:t>
+      </w:r>
+    </w:p>
+    <w:p>
+      <w:pPr>
+        <w:pStyle w:val="Code"/>
+      </w:pPr>
+      <w:r>
+        <w:rPr>
+          <w:rFonts w:ascii="Times New Roman" w:hAnsi="Times New Roman"/>
+          <w:sz w:val="24"/>
+        </w:rPr>
+        <w:t xml:space="preserve">text content</w:t>
+      </w:r>
+    </w:p>
+    <w:p>
+      <w:pPr>
+        <w:pStyle w:val="Code"/>
+      </w:pPr>
+      <w:r>
+        <w:rPr>
+          <w:rFonts w:ascii="Times New Roman" w:hAnsi="Times New Roman"/>
+          <w:sz w:val="24"/>
+        </w:rPr>
+        <w:t xml:space="preserve">text status</w:t>
+      </w:r>
+    </w:p>
+    <w:p>
+      <w:pPr>
+        <w:pStyle w:val="Code"/>
+      </w:pPr>
+      <w:r>
+        <w:rPr>
+          <w:rFonts w:ascii="Times New Roman" w:hAnsi="Times New Roman"/>
+          <w:sz w:val="24"/>
+        </w:rPr>
+        <w:t xml:space="preserve">text created_at</w:t>
+      </w:r>
+    </w:p>
+    <w:p>
+      <w:pPr>
+        <w:pStyle w:val="Code"/>
+      </w:pPr>
+      <w:r>
+        <w:rPr>
+          <w:rFonts w:ascii="Times New Roman" w:hAnsi="Times New Roman"/>
+          <w:sz w:val="24"/>
+        </w:rPr>
+        <w:t xml:space="preserve">text reviewed_at</w:t>
+      </w:r>
+    </w:p>
+    <w:p>
+      <w:pPr>
+        <w:pStyle w:val="Code"/>
+      </w:pPr>
+      <w:r>
+        <w:rPr>
+          <w:rFonts w:ascii="Times New Roman" w:hAnsi="Times New Roman"/>
+          <w:sz w:val="24"/>
+        </w:rPr>
+        <w:t xml:space="preserve">}</w:t>
+      </w:r>
+    </w:p>
+    <w:p/>
+    <w:p>
+      <w:pPr>
+        <w:pStyle w:val="Code"/>
+      </w:pPr>
+      <w:r>
+        <w:rPr>
+          <w:rFonts w:ascii="Times New Roman" w:hAnsi="Times New Roman"/>
+          <w:sz w:val="24"/>
+        </w:rPr>
+        <w:t xml:space="preserve">PEER_NOTE_REVIEWS {</w:t>
+      </w:r>
+    </w:p>
+    <w:p>
+      <w:pPr>
+        <w:pStyle w:val="Code"/>
+      </w:pPr>
+      <w:r>
+        <w:rPr>
+          <w:rFonts w:ascii="Times New Roman" w:hAnsi="Times New Roman"/>
+          <w:sz w:val="24"/>
+        </w:rPr>
+        <w:t xml:space="preserve">integer id PK</w:t>
+      </w:r>
+    </w:p>
+    <w:p>
+      <w:pPr>
+        <w:pStyle w:val="Code"/>
+      </w:pPr>
+      <w:r>
+        <w:rPr>
+          <w:rFonts w:ascii="Times New Roman" w:hAnsi="Times New Roman"/>
+          <w:sz w:val="24"/>
+        </w:rPr>
+        <w:t xml:space="preserve">text note_id FK</w:t>
+      </w:r>
+    </w:p>
+    <w:p>
+      <w:pPr>
+        <w:pStyle w:val="Code"/>
+      </w:pPr>
+      <w:r>
+        <w:rPr>
+          <w:rFonts w:ascii="Times New Roman" w:hAnsi="Times New Roman"/>
+          <w:sz w:val="24"/>
+        </w:rPr>
+        <w:t xml:space="preserve">text reviewer_id</w:t>
+      </w:r>
+    </w:p>
+    <w:p>
+      <w:pPr>
+        <w:pStyle w:val="Code"/>
+      </w:pPr>
+      <w:r>
+        <w:rPr>
+          <w:rFonts w:ascii="Times New Roman" w:hAnsi="Times New Roman"/>
+          <w:sz w:val="24"/>
+        </w:rPr>
+        <w:t xml:space="preserve">text action</w:t>
+      </w:r>
+    </w:p>
+    <w:p>
+      <w:pPr>
+        <w:pStyle w:val="Code"/>
+      </w:pPr>
+      <w:r>
+        <w:rPr>
+          <w:rFonts w:ascii="Times New Roman" w:hAnsi="Times New Roman"/>
+          <w:sz w:val="24"/>
+        </w:rPr>
+        <w:t xml:space="preserve">text comment</w:t>
       </w:r>
     </w:p>
     <w:p>
@@ -5357,6 +5800,66 @@
           </w:p>
         </w:tc>
       </w:tr>
+      <w:tr>
+        <w:tc>
+          <w:tcPr>
+            <w:tcW w:w="2400" w:type="dxa"/>
+          </w:tcPr>
+          <w:p>
+            <w:r>
+              <w:rPr>
+                <w:rFonts w:ascii="Times New Roman" w:hAnsi="Times New Roman"/>
+                <w:sz w:val="24"/>
+              </w:rPr>
+              <w:t xml:space="preserve">`peer_notes`</w:t>
+            </w:r>
+          </w:p>
+        </w:tc>
+        <w:tc>
+          <w:tcPr>
+            <w:tcW w:w="2400" w:type="dxa"/>
+          </w:tcPr>
+          <w:p>
+            <w:r>
+              <w:rPr>
+                <w:rFonts w:ascii="Times New Roman" w:hAnsi="Times New Roman"/>
+                <w:sz w:val="24"/>
+              </w:rPr>
+              <w:t xml:space="preserve">Stores student course-note submissions and moderation status.</w:t>
+            </w:r>
+          </w:p>
+        </w:tc>
+      </w:tr>
+      <w:tr>
+        <w:tc>
+          <w:tcPr>
+            <w:tcW w:w="2400" w:type="dxa"/>
+          </w:tcPr>
+          <w:p>
+            <w:r>
+              <w:rPr>
+                <w:rFonts w:ascii="Times New Roman" w:hAnsi="Times New Roman"/>
+                <w:sz w:val="24"/>
+              </w:rPr>
+              <w:t xml:space="preserve">`peer_note_reviews`</w:t>
+            </w:r>
+          </w:p>
+        </w:tc>
+        <w:tc>
+          <w:tcPr>
+            <w:tcW w:w="2400" w:type="dxa"/>
+          </w:tcPr>
+          <w:p>
+            <w:r>
+              <w:rPr>
+                <w:rFonts w:ascii="Times New Roman" w:hAnsi="Times New Roman"/>
+                <w:sz w:val="24"/>
+              </w:rPr>
+              <w:t xml:space="preserve">Stores lecturer or admin review actions for submitted notes.</w:t>
+            </w:r>
+          </w:p>
+        </w:tc>
+      </w:tr>
     </w:tbl>
     <w:p/>
     <w:p>
@@ -5365,7 +5868,7 @@
           <w:rFonts w:ascii="Times New Roman" w:hAnsi="Times New Roman"/>
           <w:sz w:val="24"/>
         </w:rPr>
-        <w:t xml:space="preserve">The JSON sample records store demo users, student profiles, lecturer profiles, and course analytics. The SQLite database stores runtime progress history.</w:t>
+        <w:t xml:space="preserve">The JSON sample records store demo users, student profiles, lecturer profiles, and course analytics. The SQLite database stores runtime progress history and peer-note moderation records.</w:t>
       </w:r>
     </w:p>
     <w:p/>
@@ -6872,7 +7375,7 @@
           <w:rFonts w:ascii="Times New Roman" w:hAnsi="Times New Roman"/>
           <w:sz w:val="24"/>
         </w:rPr>
-        <w:t xml:space="preserve">The frontend was implemented using Flutter. It provides a responsive interface for guest, student, and lecturer users. The interface includes login mode selection, chat, tools, admissions estimator, student learning progress dashboard, guided learning session screen, lecturer workbench, and profile/account switcher.</w:t>
+        <w:t xml:space="preserve">The frontend was implemented using Flutter. It provides a responsive interface for guest, student, and lecturer users. The interface includes login mode selection, chat, tools, admissions estimator, student learning progress dashboard, guided learning session screen, upload-assisted Ask Eve, peer-note contribution, lecturer workbench, knowledge governance views, and profile/account switcher.</w:t>
       </w:r>
     </w:p>
     <w:p/>
@@ -7308,6 +7811,112 @@
     <w:p/>
     <w:p>
       <w:pPr>
+        <w:pStyle w:val="Heading3"/>
+      </w:pPr>
+      <w:r>
+        <w:rPr>
+          <w:b/>
+          <w:rFonts w:ascii="Times New Roman" w:hAnsi="Times New Roman"/>
+          <w:sz w:val="24"/>
+        </w:rPr>
+        <w:t xml:space="preserve">4.3.8 Upload-Assisted Ask Eve Implementation</w:t>
+      </w:r>
+    </w:p>
+    <w:p/>
+    <w:p>
+      <w:r>
+        <w:rPr>
+          <w:rFonts w:ascii="Times New Roman" w:hAnsi="Times New Roman"/>
+          <w:sz w:val="24"/>
+        </w:rPr>
+        <w:t xml:space="preserve">The Ask Eve module supports file-assisted academic questions. A student can upload a supported note file and ask Eve to summarize, explain, or turn the content into a study plan. This makes the assistant more useful for personalized learning because it can respond to a student's own learning material instead of only answering from general knowledge.</w:t>
+      </w:r>
+    </w:p>
+    <w:p/>
+    <w:p>
+      <w:r>
+        <w:rPr>
+          <w:rFonts w:ascii="Times New Roman" w:hAnsi="Times New Roman"/>
+          <w:sz w:val="24"/>
+        </w:rPr>
+        <w:t xml:space="preserve">For the prototype, uploaded content is treated as private session context. Eve uses it to support the student's current question, but it is not automatically published to the shared knowledge base. This design prevents unverified notes from becoming official institutional content.</w:t>
+      </w:r>
+    </w:p>
+    <w:p/>
+    <w:p>
+      <w:pPr>
+        <w:pStyle w:val="Heading3"/>
+      </w:pPr>
+      <w:r>
+        <w:rPr>
+          <w:b/>
+          <w:rFonts w:ascii="Times New Roman" w:hAnsi="Times New Roman"/>
+          <w:sz w:val="24"/>
+        </w:rPr>
+        <w:t xml:space="preserve">4.3.9 Moderated Peer Notes and Knowledge Governance Implementation</w:t>
+      </w:r>
+    </w:p>
+    <w:p/>
+    <w:p>
+      <w:r>
+        <w:rPr>
+          <w:rFonts w:ascii="Times New Roman" w:hAnsi="Times New Roman"/>
+          <w:sz w:val="24"/>
+        </w:rPr>
+        <w:t xml:space="preserve">The project also includes a moderated peer-note workflow. Students can submit helpful course notes, summaries, and explanations, but those notes do not become shared learning material until they are reviewed. Lecturers can review submissions only for courses assigned to them, while administrators can review wider institutional knowledge entries.</w:t>
+      </w:r>
+    </w:p>
+    <w:p/>
+    <w:p>
+      <w:r>
+        <w:rPr>
+          <w:rFonts w:ascii="Times New Roman" w:hAnsi="Times New Roman"/>
+          <w:sz w:val="24"/>
+        </w:rPr>
+        <w:t xml:space="preserve">The moderation process supports three outcomes:</w:t>
+      </w:r>
+    </w:p>
+    <w:p/>
+    <w:p>
+      <w:r>
+        <w:rPr>
+          <w:rFonts w:ascii="Times New Roman" w:hAnsi="Times New Roman"/>
+          <w:sz w:val="24"/>
+        </w:rPr>
+        <w:t xml:space="preserve">• approve useful and accurate notes;</w:t>
+      </w:r>
+    </w:p>
+    <w:p>
+      <w:r>
+        <w:rPr>
+          <w:rFonts w:ascii="Times New Roman" w:hAnsi="Times New Roman"/>
+          <w:sz w:val="24"/>
+        </w:rPr>
+        <w:t xml:space="preserve">• request revision when a note needs correction;</w:t>
+      </w:r>
+    </w:p>
+    <w:p>
+      <w:r>
+        <w:rPr>
+          <w:rFonts w:ascii="Times New Roman" w:hAnsi="Times New Roman"/>
+          <w:sz w:val="24"/>
+        </w:rPr>
+        <w:t xml:space="preserve">• reject unsuitable or inaccurate notes.</w:t>
+      </w:r>
+    </w:p>
+    <w:p/>
+    <w:p>
+      <w:r>
+        <w:rPr>
+          <w:rFonts w:ascii="Times New Roman" w:hAnsi="Times New Roman"/>
+          <w:sz w:val="24"/>
+        </w:rPr>
+        <w:t xml:space="preserve">Approved peer notes can be retrieved as learning support, while pending and rejected notes remain separate from the official knowledge base. This protects students from misinformation and supports academic governance.</w:t>
+      </w:r>
+    </w:p>
+    <w:p/>
+    <w:p>
+      <w:pPr>
         <w:pStyle w:val="Heading2"/>
       </w:pPr>
       <w:r>
@@ -7326,7 +7935,7 @@
           <w:rFonts w:ascii="Times New Roman" w:hAnsi="Times New Roman"/>
           <w:sz w:val="24"/>
         </w:rPr>
-        <w:t xml:space="preserve">The following screenshots should be captured from the running system for the final report:</w:t>
+        <w:t xml:space="preserve">The following screenshots were captured from the running system and are included as implementation evidence:</w:t>
       </w:r>
     </w:p>
     <w:p/>
@@ -7455,21 +8064,21 @@
                 <w:rFonts w:ascii="Times New Roman" w:hAnsi="Times New Roman"/>
                 <w:sz w:val="24"/>
               </w:rPr>
-              <w:t xml:space="preserve">Student home screen</w:t>
-            </w:r>
-          </w:p>
-        </w:tc>
-        <w:tc>
-          <w:tcPr>
-            <w:tcW w:w="2400" w:type="dxa"/>
-          </w:tcPr>
-          <w:p>
-            <w:r>
-              <w:rPr>
-                <w:rFonts w:ascii="Times New Roman" w:hAnsi="Times New Roman"/>
-                <w:sz w:val="24"/>
-              </w:rPr>
-              <w:t xml:space="preserve">Shows personalized student welcome and quick actions.</w:t>
+              <w:t xml:space="preserve">Personalized student dashboard</w:t>
+            </w:r>
+          </w:p>
+        </w:tc>
+        <w:tc>
+          <w:tcPr>
+            <w:tcW w:w="2400" w:type="dxa"/>
+          </w:tcPr>
+          <w:p>
+            <w:r>
+              <w:rPr>
+                <w:rFonts w:ascii="Times New Roman" w:hAnsi="Times New Roman"/>
+                <w:sz w:val="24"/>
+              </w:rPr>
+              <w:t xml:space="preserve">Shows today's focus, weak topic, progress, and peer-note activity.</w:t>
             </w:r>
           </w:p>
         </w:tc>
@@ -7499,21 +8108,21 @@
                 <w:rFonts w:ascii="Times New Roman" w:hAnsi="Times New Roman"/>
                 <w:sz w:val="24"/>
               </w:rPr>
-              <w:t xml:space="preserve">Chat interface</w:t>
-            </w:r>
-          </w:p>
-        </w:tc>
-        <w:tc>
-          <w:tcPr>
-            <w:tcW w:w="2400" w:type="dxa"/>
-          </w:tcPr>
-          <w:p>
-            <w:r>
-              <w:rPr>
-                <w:rFonts w:ascii="Times New Roman" w:hAnsi="Times New Roman"/>
-                <w:sz w:val="24"/>
-              </w:rPr>
-              <w:t xml:space="preserve">Shows Eve answering a student question in OpenAI mode.</w:t>
+              <w:t xml:space="preserve">Mobile responsive dashboard</w:t>
+            </w:r>
+          </w:p>
+        </w:tc>
+        <w:tc>
+          <w:tcPr>
+            <w:tcW w:w="2400" w:type="dxa"/>
+          </w:tcPr>
+          <w:p>
+            <w:r>
+              <w:rPr>
+                <w:rFonts w:ascii="Times New Roman" w:hAnsi="Times New Roman"/>
+                <w:sz w:val="24"/>
+              </w:rPr>
+              <w:t xml:space="preserve">Shows the same student dashboard adapted to a phone screen.</w:t>
             </w:r>
           </w:p>
         </w:tc>
@@ -7543,21 +8152,21 @@
                 <w:rFonts w:ascii="Times New Roman" w:hAnsi="Times New Roman"/>
                 <w:sz w:val="24"/>
               </w:rPr>
-              <w:t xml:space="preserve">Student learning progress dashboard</w:t>
-            </w:r>
-          </w:p>
-        </w:tc>
-        <w:tc>
-          <w:tcPr>
-            <w:tcW w:w="2400" w:type="dxa"/>
-          </w:tcPr>
-          <w:p>
-            <w:r>
-              <w:rPr>
-                <w:rFonts w:ascii="Times New Roman" w:hAnsi="Times New Roman"/>
-                <w:sz w:val="24"/>
-              </w:rPr>
-              <w:t xml:space="preserve">Shows overall progress, weak topics, completed sessions, and quiz average.</w:t>
+              <w:t xml:space="preserve">Ask Eve conversation</w:t>
+            </w:r>
+          </w:p>
+        </w:tc>
+        <w:tc>
+          <w:tcPr>
+            <w:tcW w:w="2400" w:type="dxa"/>
+          </w:tcPr>
+          <w:p>
+            <w:r>
+              <w:rPr>
+                <w:rFonts w:ascii="Times New Roman" w:hAnsi="Times New Roman"/>
+                <w:sz w:val="24"/>
+              </w:rPr>
+              <w:t xml:space="preserve">Shows Eve giving personalized academic guidance.</w:t>
             </w:r>
           </w:p>
         </w:tc>
@@ -7587,21 +8196,21 @@
                 <w:rFonts w:ascii="Times New Roman" w:hAnsi="Times New Roman"/>
                 <w:sz w:val="24"/>
               </w:rPr>
-              <w:t xml:space="preserve">Guided learning session screen</w:t>
-            </w:r>
-          </w:p>
-        </w:tc>
-        <w:tc>
-          <w:tcPr>
-            <w:tcW w:w="2400" w:type="dxa"/>
-          </w:tcPr>
-          <w:p>
-            <w:r>
-              <w:rPr>
-                <w:rFonts w:ascii="Times New Roman" w:hAnsi="Times New Roman"/>
-                <w:sz w:val="24"/>
-              </w:rPr>
-              <w:t xml:space="preserve">Shows concept explanation, worked example, and quiz answer box.</w:t>
+              <w:t xml:space="preserve">Upload-assisted Ask Eve</w:t>
+            </w:r>
+          </w:p>
+        </w:tc>
+        <w:tc>
+          <w:tcPr>
+            <w:tcW w:w="2400" w:type="dxa"/>
+          </w:tcPr>
+          <w:p>
+            <w:r>
+              <w:rPr>
+                <w:rFonts w:ascii="Times New Roman" w:hAnsi="Times New Roman"/>
+                <w:sz w:val="24"/>
+              </w:rPr>
+              <w:t xml:space="preserve">Shows Eve using an uploaded CSC note to support a student's question.</w:t>
             </w:r>
           </w:p>
         </w:tc>
@@ -7631,21 +8240,21 @@
                 <w:rFonts w:ascii="Times New Roman" w:hAnsi="Times New Roman"/>
                 <w:sz w:val="24"/>
               </w:rPr>
-              <w:t xml:space="preserve">Feedback history screen</w:t>
-            </w:r>
-          </w:p>
-        </w:tc>
-        <w:tc>
-          <w:tcPr>
-            <w:tcW w:w="2400" w:type="dxa"/>
-          </w:tcPr>
-          <w:p>
-            <w:r>
-              <w:rPr>
-                <w:rFonts w:ascii="Times New Roman" w:hAnsi="Times New Roman"/>
-                <w:sz w:val="24"/>
-              </w:rPr>
-              <w:t xml:space="preserve">Shows scores and feedback after student answers.</w:t>
+              <w:t xml:space="preserve">Guided learning session</w:t>
+            </w:r>
+          </w:p>
+        </w:tc>
+        <w:tc>
+          <w:tcPr>
+            <w:tcW w:w="2400" w:type="dxa"/>
+          </w:tcPr>
+          <w:p>
+            <w:r>
+              <w:rPr>
+                <w:rFonts w:ascii="Times New Roman" w:hAnsi="Times New Roman"/>
+                <w:sz w:val="24"/>
+              </w:rPr>
+              <w:t xml:space="preserve">Shows concept explanation and practice question support.</w:t>
             </w:r>
           </w:p>
         </w:tc>
@@ -7675,21 +8284,21 @@
                 <w:rFonts w:ascii="Times New Roman" w:hAnsi="Times New Roman"/>
                 <w:sz w:val="24"/>
               </w:rPr>
-              <w:t xml:space="preserve">Lecturer teaching workbench</w:t>
-            </w:r>
-          </w:p>
-        </w:tc>
-        <w:tc>
-          <w:tcPr>
-            <w:tcW w:w="2400" w:type="dxa"/>
-          </w:tcPr>
-          <w:p>
-            <w:r>
-              <w:rPr>
-                <w:rFonts w:ascii="Times New Roman" w:hAnsi="Times New Roman"/>
-                <w:sz w:val="24"/>
-              </w:rPr>
-              <w:t xml:space="preserve">Shows assigned-course saved learning trends.</w:t>
+              <w:t xml:space="preserve">Peer-note submission</w:t>
+            </w:r>
+          </w:p>
+        </w:tc>
+        <w:tc>
+          <w:tcPr>
+            <w:tcW w:w="2400" w:type="dxa"/>
+          </w:tcPr>
+          <w:p>
+            <w:r>
+              <w:rPr>
+                <w:rFonts w:ascii="Times New Roman" w:hAnsi="Times New Roman"/>
+                <w:sz w:val="24"/>
+              </w:rPr>
+              <w:t xml:space="preserve">Shows the student contribution form.</w:t>
             </w:r>
           </w:p>
         </w:tc>
@@ -7719,21 +8328,21 @@
                 <w:rFonts w:ascii="Times New Roman" w:hAnsi="Times New Roman"/>
                 <w:sz w:val="24"/>
               </w:rPr>
-              <w:t xml:space="preserve">Admission readiness estimator</w:t>
-            </w:r>
-          </w:p>
-        </w:tc>
-        <w:tc>
-          <w:tcPr>
-            <w:tcW w:w="2400" w:type="dxa"/>
-          </w:tcPr>
-          <w:p>
-            <w:r>
-              <w:rPr>
-                <w:rFonts w:ascii="Times New Roman" w:hAnsi="Times New Roman"/>
-                <w:sz w:val="24"/>
-              </w:rPr>
-              <w:t xml:space="preserve">Shows JAMB and O-Level readiness guidance.</w:t>
+              <w:t xml:space="preserve">Lecturer peer-note review</w:t>
+            </w:r>
+          </w:p>
+        </w:tc>
+        <w:tc>
+          <w:tcPr>
+            <w:tcW w:w="2400" w:type="dxa"/>
+          </w:tcPr>
+          <w:p>
+            <w:r>
+              <w:rPr>
+                <w:rFonts w:ascii="Times New Roman" w:hAnsi="Times New Roman"/>
+                <w:sz w:val="24"/>
+              </w:rPr>
+              <w:t xml:space="preserve">Shows approve, reject, and revise moderation actions.</w:t>
             </w:r>
           </w:p>
         </w:tc>
@@ -7763,26 +8372,758 @@
                 <w:rFonts w:ascii="Times New Roman" w:hAnsi="Times New Roman"/>
                 <w:sz w:val="24"/>
               </w:rPr>
-              <w:t xml:space="preserve">Profile/account switcher</w:t>
-            </w:r>
-          </w:p>
-        </w:tc>
-        <w:tc>
-          <w:tcPr>
-            <w:tcW w:w="2400" w:type="dxa"/>
-          </w:tcPr>
-          <w:p>
-            <w:r>
-              <w:rPr>
-                <w:rFonts w:ascii="Times New Roman" w:hAnsi="Times New Roman"/>
-                <w:sz w:val="24"/>
-              </w:rPr>
-              <w:t xml:space="preserve">Shows role-based demo accounts.</w:t>
+              <w:t xml:space="preserve">Lecturer analytics</w:t>
+            </w:r>
+          </w:p>
+        </w:tc>
+        <w:tc>
+          <w:tcPr>
+            <w:tcW w:w="2400" w:type="dxa"/>
+          </w:tcPr>
+          <w:p>
+            <w:r>
+              <w:rPr>
+                <w:rFonts w:ascii="Times New Roman" w:hAnsi="Times New Roman"/>
+                <w:sz w:val="24"/>
+              </w:rPr>
+              <w:t xml:space="preserve">Shows assigned-course analytics and intervention insight.</w:t>
+            </w:r>
+          </w:p>
+        </w:tc>
+      </w:tr>
+      <w:tr>
+        <w:tc>
+          <w:tcPr>
+            <w:tcW w:w="2400" w:type="dxa"/>
+          </w:tcPr>
+          <w:p>
+            <w:r>
+              <w:rPr>
+                <w:rFonts w:ascii="Times New Roman" w:hAnsi="Times New Roman"/>
+                <w:sz w:val="24"/>
+              </w:rPr>
+              <w:t xml:space="preserve">Figure 4.10</w:t>
+            </w:r>
+          </w:p>
+        </w:tc>
+        <w:tc>
+          <w:tcPr>
+            <w:tcW w:w="2400" w:type="dxa"/>
+          </w:tcPr>
+          <w:p>
+            <w:r>
+              <w:rPr>
+                <w:rFonts w:ascii="Times New Roman" w:hAnsi="Times New Roman"/>
+                <w:sz w:val="24"/>
+              </w:rPr>
+              <w:t xml:space="preserve">Admission readiness estimator</w:t>
+            </w:r>
+          </w:p>
+        </w:tc>
+        <w:tc>
+          <w:tcPr>
+            <w:tcW w:w="2400" w:type="dxa"/>
+          </w:tcPr>
+          <w:p>
+            <w:r>
+              <w:rPr>
+                <w:rFonts w:ascii="Times New Roman" w:hAnsi="Times New Roman"/>
+                <w:sz w:val="24"/>
+              </w:rPr>
+              <w:t xml:space="preserve">Shows public guidance for Computer Science admission readiness.</w:t>
+            </w:r>
+          </w:p>
+        </w:tc>
+      </w:tr>
+      <w:tr>
+        <w:tc>
+          <w:tcPr>
+            <w:tcW w:w="2400" w:type="dxa"/>
+          </w:tcPr>
+          <w:p>
+            <w:r>
+              <w:rPr>
+                <w:rFonts w:ascii="Times New Roman" w:hAnsi="Times New Roman"/>
+                <w:sz w:val="24"/>
+              </w:rPr>
+              <w:t xml:space="preserve">Figure 4.11</w:t>
+            </w:r>
+          </w:p>
+        </w:tc>
+        <w:tc>
+          <w:tcPr>
+            <w:tcW w:w="2400" w:type="dxa"/>
+          </w:tcPr>
+          <w:p>
+            <w:r>
+              <w:rPr>
+                <w:rFonts w:ascii="Times New Roman" w:hAnsi="Times New Roman"/>
+                <w:sz w:val="24"/>
+              </w:rPr>
+              <w:t xml:space="preserve">Admin knowledge library</w:t>
+            </w:r>
+          </w:p>
+        </w:tc>
+        <w:tc>
+          <w:tcPr>
+            <w:tcW w:w="2400" w:type="dxa"/>
+          </w:tcPr>
+          <w:p>
+            <w:r>
+              <w:rPr>
+                <w:rFonts w:ascii="Times New Roman" w:hAnsi="Times New Roman"/>
+                <w:sz w:val="24"/>
+              </w:rPr>
+              <w:t xml:space="preserve">Shows curated institutional knowledge entries and governance controls.</w:t>
+            </w:r>
+          </w:p>
+        </w:tc>
+      </w:tr>
+      <w:tr>
+        <w:tc>
+          <w:tcPr>
+            <w:tcW w:w="2400" w:type="dxa"/>
+          </w:tcPr>
+          <w:p>
+            <w:r>
+              <w:rPr>
+                <w:rFonts w:ascii="Times New Roman" w:hAnsi="Times New Roman"/>
+                <w:sz w:val="24"/>
+              </w:rPr>
+              <w:t xml:space="preserve">Figure 4.12</w:t>
+            </w:r>
+          </w:p>
+        </w:tc>
+        <w:tc>
+          <w:tcPr>
+            <w:tcW w:w="2400" w:type="dxa"/>
+          </w:tcPr>
+          <w:p>
+            <w:r>
+              <w:rPr>
+                <w:rFonts w:ascii="Times New Roman" w:hAnsi="Times New Roman"/>
+                <w:sz w:val="24"/>
+              </w:rPr>
+              <w:t xml:space="preserve">Backend health endpoint</w:t>
+            </w:r>
+          </w:p>
+        </w:tc>
+        <w:tc>
+          <w:tcPr>
+            <w:tcW w:w="2400" w:type="dxa"/>
+          </w:tcPr>
+          <w:p>
+            <w:r>
+              <w:rPr>
+                <w:rFonts w:ascii="Times New Roman" w:hAnsi="Times New Roman"/>
+                <w:sz w:val="24"/>
+              </w:rPr>
+              <w:t xml:space="preserve">Shows the deployed backend running in OpenAI Responses API mode.</w:t>
             </w:r>
           </w:p>
         </w:tc>
       </w:tr>
     </w:tbl>
+    <w:p/>
+    <w:p>
+      <w:r>
+        <w:drawing>
+          <wp:inline distT="0" distB="0" distL="0" distR="0">
+            <wp:extent cx="5799999" cy="2773726"/>
+            <wp:effectExtent l="0" t="0" r="0" b="0"/>
+            <wp:docPr id="1" name="Figure 1" descr="Figure 4.1: Eve role selection and login screen."/>
+            <wp:cNvGraphicFramePr>
+              <a:graphicFrameLocks noChangeAspect="1"/>
+            </wp:cNvGraphicFramePr>
+            <a:graphic>
+              <a:graphicData uri="http://schemas.openxmlformats.org/drawingml/2006/picture">
+                <pic:pic>
+                  <pic:nvPicPr>
+                    <pic:cNvPr id="0" name="image1.png"/>
+                    <pic:cNvPicPr/>
+                  </pic:nvPicPr>
+                  <pic:blipFill>
+                    <a:blip r:embed="rIdImage1"/>
+                    <a:stretch>
+                      <a:fillRect/>
+                    </a:stretch>
+                  </pic:blipFill>
+                  <pic:spPr>
+                    <a:xfrm>
+                      <a:off x="0" y="0"/>
+                      <a:ext cx="5799999" cy="2773726"/>
+                    </a:xfrm>
+                    <a:prstGeom prst="rect">
+                      <a:avLst/>
+                    </a:prstGeom>
+                  </pic:spPr>
+                </pic:pic>
+              </a:graphicData>
+            </a:graphic>
+          </wp:inline>
+        </w:drawing>
+      </w:r>
+    </w:p>
+    <w:p>
+      <w:r>
+        <w:rPr>
+          <w:b/>
+          <w:rFonts w:ascii="Times New Roman" w:hAnsi="Times New Roman"/>
+          <w:sz w:val="24"/>
+        </w:rPr>
+        <w:t xml:space="preserve">Figure 4.1: Eve role selection and login screen.</w:t>
+      </w:r>
+    </w:p>
+    <w:p/>
+    <w:p>
+      <w:r>
+        <w:drawing>
+          <wp:inline distT="0" distB="0" distL="0" distR="0">
+            <wp:extent cx="5800000" cy="2751390"/>
+            <wp:effectExtent l="0" t="0" r="0" b="0"/>
+            <wp:docPr id="2" name="Figure 2" descr="Figure 4.2: Personalized student dashboard showing today's focus, weak topic, progress, and peer-note activity."/>
+            <wp:cNvGraphicFramePr>
+              <a:graphicFrameLocks noChangeAspect="1"/>
+            </wp:cNvGraphicFramePr>
+            <a:graphic>
+              <a:graphicData uri="http://schemas.openxmlformats.org/drawingml/2006/picture">
+                <pic:pic>
+                  <pic:nvPicPr>
+                    <pic:cNvPr id="0" name="image2.png"/>
+                    <pic:cNvPicPr/>
+                  </pic:nvPicPr>
+                  <pic:blipFill>
+                    <a:blip r:embed="rIdImage2"/>
+                    <a:stretch>
+                      <a:fillRect/>
+                    </a:stretch>
+                  </pic:blipFill>
+                  <pic:spPr>
+                    <a:xfrm>
+                      <a:off x="0" y="0"/>
+                      <a:ext cx="5800000" cy="2751390"/>
+                    </a:xfrm>
+                    <a:prstGeom prst="rect">
+                      <a:avLst/>
+                    </a:prstGeom>
+                  </pic:spPr>
+                </pic:pic>
+              </a:graphicData>
+            </a:graphic>
+          </wp:inline>
+        </w:drawing>
+      </w:r>
+    </w:p>
+    <w:p>
+      <w:r>
+        <w:rPr>
+          <w:b/>
+          <w:rFonts w:ascii="Times New Roman" w:hAnsi="Times New Roman"/>
+          <w:sz w:val="24"/>
+        </w:rPr>
+        <w:t xml:space="preserve">Figure 4.2: Personalized student dashboard showing today's focus, weak topic, progress, and peer-note activity.</w:t>
+      </w:r>
+    </w:p>
+    <w:p/>
+    <w:p>
+      <w:r>
+        <w:drawing>
+          <wp:inline distT="0" distB="0" distL="0" distR="0">
+            <wp:extent cx="2262295" cy="4600000"/>
+            <wp:effectExtent l="0" t="0" r="0" b="0"/>
+            <wp:docPr id="3" name="Figure 3" descr="Figure 4.3: Mobile responsive view of the personalized student dashboard."/>
+            <wp:cNvGraphicFramePr>
+              <a:graphicFrameLocks noChangeAspect="1"/>
+            </wp:cNvGraphicFramePr>
+            <a:graphic>
+              <a:graphicData uri="http://schemas.openxmlformats.org/drawingml/2006/picture">
+                <pic:pic>
+                  <pic:nvPicPr>
+                    <pic:cNvPr id="0" name="image3.jpeg"/>
+                    <pic:cNvPicPr/>
+                  </pic:nvPicPr>
+                  <pic:blipFill>
+                    <a:blip r:embed="rIdImage3"/>
+                    <a:stretch>
+                      <a:fillRect/>
+                    </a:stretch>
+                  </pic:blipFill>
+                  <pic:spPr>
+                    <a:xfrm>
+                      <a:off x="0" y="0"/>
+                      <a:ext cx="2262295" cy="4600000"/>
+                    </a:xfrm>
+                    <a:prstGeom prst="rect">
+                      <a:avLst/>
+                    </a:prstGeom>
+                  </pic:spPr>
+                </pic:pic>
+              </a:graphicData>
+            </a:graphic>
+          </wp:inline>
+        </w:drawing>
+      </w:r>
+    </w:p>
+    <w:p>
+      <w:r>
+        <w:rPr>
+          <w:b/>
+          <w:rFonts w:ascii="Times New Roman" w:hAnsi="Times New Roman"/>
+          <w:sz w:val="24"/>
+        </w:rPr>
+        <w:t xml:space="preserve">Figure 4.3: Mobile responsive view of the personalized student dashboard.</w:t>
+      </w:r>
+    </w:p>
+    <w:p/>
+    <w:p>
+      <w:r>
+        <w:drawing>
+          <wp:inline distT="0" distB="0" distL="0" distR="0">
+            <wp:extent cx="5800000" cy="2759264"/>
+            <wp:effectExtent l="0" t="0" r="0" b="0"/>
+            <wp:docPr id="4" name="Figure 4" descr="Figure 4.4: Ask Eve conversation showing personalized academic guidance."/>
+            <wp:cNvGraphicFramePr>
+              <a:graphicFrameLocks noChangeAspect="1"/>
+            </wp:cNvGraphicFramePr>
+            <a:graphic>
+              <a:graphicData uri="http://schemas.openxmlformats.org/drawingml/2006/picture">
+                <pic:pic>
+                  <pic:nvPicPr>
+                    <pic:cNvPr id="0" name="image4.png"/>
+                    <pic:cNvPicPr/>
+                  </pic:nvPicPr>
+                  <pic:blipFill>
+                    <a:blip r:embed="rIdImage4"/>
+                    <a:stretch>
+                      <a:fillRect/>
+                    </a:stretch>
+                  </pic:blipFill>
+                  <pic:spPr>
+                    <a:xfrm>
+                      <a:off x="0" y="0"/>
+                      <a:ext cx="5800000" cy="2759264"/>
+                    </a:xfrm>
+                    <a:prstGeom prst="rect">
+                      <a:avLst/>
+                    </a:prstGeom>
+                  </pic:spPr>
+                </pic:pic>
+              </a:graphicData>
+            </a:graphic>
+          </wp:inline>
+        </w:drawing>
+      </w:r>
+    </w:p>
+    <w:p>
+      <w:r>
+        <w:rPr>
+          <w:b/>
+          <w:rFonts w:ascii="Times New Roman" w:hAnsi="Times New Roman"/>
+          <w:sz w:val="24"/>
+        </w:rPr>
+        <w:t xml:space="preserve">Figure 4.4: Ask Eve conversation showing personalized academic guidance.</w:t>
+      </w:r>
+    </w:p>
+    <w:p/>
+    <w:p>
+      <w:r>
+        <w:drawing>
+          <wp:inline distT="0" distB="0" distL="0" distR="0">
+            <wp:extent cx="5800000" cy="2734407"/>
+            <wp:effectExtent l="0" t="0" r="0" b="0"/>
+            <wp:docPr id="5" name="Figure 5" descr="Figure 4.5: Upload-assisted Ask Eve conversation using a CSC 201 note."/>
+            <wp:cNvGraphicFramePr>
+              <a:graphicFrameLocks noChangeAspect="1"/>
+            </wp:cNvGraphicFramePr>
+            <a:graphic>
+              <a:graphicData uri="http://schemas.openxmlformats.org/drawingml/2006/picture">
+                <pic:pic>
+                  <pic:nvPicPr>
+                    <pic:cNvPr id="0" name="image5.png"/>
+                    <pic:cNvPicPr/>
+                  </pic:nvPicPr>
+                  <pic:blipFill>
+                    <a:blip r:embed="rIdImage5"/>
+                    <a:stretch>
+                      <a:fillRect/>
+                    </a:stretch>
+                  </pic:blipFill>
+                  <pic:spPr>
+                    <a:xfrm>
+                      <a:off x="0" y="0"/>
+                      <a:ext cx="5800000" cy="2734407"/>
+                    </a:xfrm>
+                    <a:prstGeom prst="rect">
+                      <a:avLst/>
+                    </a:prstGeom>
+                  </pic:spPr>
+                </pic:pic>
+              </a:graphicData>
+            </a:graphic>
+          </wp:inline>
+        </w:drawing>
+      </w:r>
+    </w:p>
+    <w:p>
+      <w:r>
+        <w:rPr>
+          <w:b/>
+          <w:rFonts w:ascii="Times New Roman" w:hAnsi="Times New Roman"/>
+          <w:sz w:val="24"/>
+        </w:rPr>
+        <w:t xml:space="preserve">Figure 4.5: Upload-assisted Ask Eve conversation using a CSC 201 note.</w:t>
+      </w:r>
+    </w:p>
+    <w:p/>
+    <w:p>
+      <w:r>
+        <w:drawing>
+          <wp:inline distT="0" distB="0" distL="0" distR="0">
+            <wp:extent cx="5799999" cy="2746696"/>
+            <wp:effectExtent l="0" t="0" r="0" b="0"/>
+            <wp:docPr id="6" name="Figure 6" descr="Figure 4.6: Guided CSC 201 learning session with concept explanation and practice question."/>
+            <wp:cNvGraphicFramePr>
+              <a:graphicFrameLocks noChangeAspect="1"/>
+            </wp:cNvGraphicFramePr>
+            <a:graphic>
+              <a:graphicData uri="http://schemas.openxmlformats.org/drawingml/2006/picture">
+                <pic:pic>
+                  <pic:nvPicPr>
+                    <pic:cNvPr id="0" name="image6.png"/>
+                    <pic:cNvPicPr/>
+                  </pic:nvPicPr>
+                  <pic:blipFill>
+                    <a:blip r:embed="rIdImage6"/>
+                    <a:stretch>
+                      <a:fillRect/>
+                    </a:stretch>
+                  </pic:blipFill>
+                  <pic:spPr>
+                    <a:xfrm>
+                      <a:off x="0" y="0"/>
+                      <a:ext cx="5799999" cy="2746696"/>
+                    </a:xfrm>
+                    <a:prstGeom prst="rect">
+                      <a:avLst/>
+                    </a:prstGeom>
+                  </pic:spPr>
+                </pic:pic>
+              </a:graphicData>
+            </a:graphic>
+          </wp:inline>
+        </w:drawing>
+      </w:r>
+    </w:p>
+    <w:p>
+      <w:r>
+        <w:rPr>
+          <w:b/>
+          <w:rFonts w:ascii="Times New Roman" w:hAnsi="Times New Roman"/>
+          <w:sz w:val="24"/>
+        </w:rPr>
+        <w:t xml:space="preserve">Figure 4.6: Guided CSC 201 learning session with concept explanation and practice question.</w:t>
+      </w:r>
+    </w:p>
+    <w:p/>
+    <w:p>
+      <w:r>
+        <w:drawing>
+          <wp:inline distT="0" distB="0" distL="0" distR="0">
+            <wp:extent cx="5800000" cy="2751173"/>
+            <wp:effectExtent l="0" t="0" r="0" b="0"/>
+            <wp:docPr id="7" name="Figure 7" descr="Figure 4.7: Student peer-note submission form."/>
+            <wp:cNvGraphicFramePr>
+              <a:graphicFrameLocks noChangeAspect="1"/>
+            </wp:cNvGraphicFramePr>
+            <a:graphic>
+              <a:graphicData uri="http://schemas.openxmlformats.org/drawingml/2006/picture">
+                <pic:pic>
+                  <pic:nvPicPr>
+                    <pic:cNvPr id="0" name="image7.png"/>
+                    <pic:cNvPicPr/>
+                  </pic:nvPicPr>
+                  <pic:blipFill>
+                    <a:blip r:embed="rIdImage7"/>
+                    <a:stretch>
+                      <a:fillRect/>
+                    </a:stretch>
+                  </pic:blipFill>
+                  <pic:spPr>
+                    <a:xfrm>
+                      <a:off x="0" y="0"/>
+                      <a:ext cx="5800000" cy="2751173"/>
+                    </a:xfrm>
+                    <a:prstGeom prst="rect">
+                      <a:avLst/>
+                    </a:prstGeom>
+                  </pic:spPr>
+                </pic:pic>
+              </a:graphicData>
+            </a:graphic>
+          </wp:inline>
+        </w:drawing>
+      </w:r>
+    </w:p>
+    <w:p>
+      <w:r>
+        <w:rPr>
+          <w:b/>
+          <w:rFonts w:ascii="Times New Roman" w:hAnsi="Times New Roman"/>
+          <w:sz w:val="24"/>
+        </w:rPr>
+        <w:t xml:space="preserve">Figure 4.7: Student peer-note submission form.</w:t>
+      </w:r>
+    </w:p>
+    <w:p/>
+    <w:p>
+      <w:r>
+        <w:drawing>
+          <wp:inline distT="0" distB="0" distL="0" distR="0">
+            <wp:extent cx="5800000" cy="2696193"/>
+            <wp:effectExtent l="0" t="0" r="0" b="0"/>
+            <wp:docPr id="8" name="Figure 8" descr="Figure 4.8: Lecturer peer-note review queue with approve, reject, and revise actions."/>
+            <wp:cNvGraphicFramePr>
+              <a:graphicFrameLocks noChangeAspect="1"/>
+            </wp:cNvGraphicFramePr>
+            <a:graphic>
+              <a:graphicData uri="http://schemas.openxmlformats.org/drawingml/2006/picture">
+                <pic:pic>
+                  <pic:nvPicPr>
+                    <pic:cNvPr id="0" name="image8.png"/>
+                    <pic:cNvPicPr/>
+                  </pic:nvPicPr>
+                  <pic:blipFill>
+                    <a:blip r:embed="rIdImage8"/>
+                    <a:stretch>
+                      <a:fillRect/>
+                    </a:stretch>
+                  </pic:blipFill>
+                  <pic:spPr>
+                    <a:xfrm>
+                      <a:off x="0" y="0"/>
+                      <a:ext cx="5800000" cy="2696193"/>
+                    </a:xfrm>
+                    <a:prstGeom prst="rect">
+                      <a:avLst/>
+                    </a:prstGeom>
+                  </pic:spPr>
+                </pic:pic>
+              </a:graphicData>
+            </a:graphic>
+          </wp:inline>
+        </w:drawing>
+      </w:r>
+    </w:p>
+    <w:p>
+      <w:r>
+        <w:rPr>
+          <w:b/>
+          <w:rFonts w:ascii="Times New Roman" w:hAnsi="Times New Roman"/>
+          <w:sz w:val="24"/>
+        </w:rPr>
+        <w:t xml:space="preserve">Figure 4.8: Lecturer peer-note review queue with approve, reject, and revise actions.</w:t>
+      </w:r>
+    </w:p>
+    <w:p/>
+    <w:p>
+      <w:r>
+        <w:drawing>
+          <wp:inline distT="0" distB="0" distL="0" distR="0">
+            <wp:extent cx="5800000" cy="2730161"/>
+            <wp:effectExtent l="0" t="0" r="0" b="0"/>
+            <wp:docPr id="9" name="Figure 9" descr="Figure 4.9: Lecturer workbench with assigned-course analytics."/>
+            <wp:cNvGraphicFramePr>
+              <a:graphicFrameLocks noChangeAspect="1"/>
+            </wp:cNvGraphicFramePr>
+            <a:graphic>
+              <a:graphicData uri="http://schemas.openxmlformats.org/drawingml/2006/picture">
+                <pic:pic>
+                  <pic:nvPicPr>
+                    <pic:cNvPr id="0" name="image9.png"/>
+                    <pic:cNvPicPr/>
+                  </pic:nvPicPr>
+                  <pic:blipFill>
+                    <a:blip r:embed="rIdImage9"/>
+                    <a:stretch>
+                      <a:fillRect/>
+                    </a:stretch>
+                  </pic:blipFill>
+                  <pic:spPr>
+                    <a:xfrm>
+                      <a:off x="0" y="0"/>
+                      <a:ext cx="5800000" cy="2730161"/>
+                    </a:xfrm>
+                    <a:prstGeom prst="rect">
+                      <a:avLst/>
+                    </a:prstGeom>
+                  </pic:spPr>
+                </pic:pic>
+              </a:graphicData>
+            </a:graphic>
+          </wp:inline>
+        </w:drawing>
+      </w:r>
+    </w:p>
+    <w:p>
+      <w:r>
+        <w:rPr>
+          <w:b/>
+          <w:rFonts w:ascii="Times New Roman" w:hAnsi="Times New Roman"/>
+          <w:sz w:val="24"/>
+        </w:rPr>
+        <w:t xml:space="preserve">Figure 4.9: Lecturer workbench with assigned-course analytics.</w:t>
+      </w:r>
+    </w:p>
+    <w:p/>
+    <w:p>
+      <w:r>
+        <w:drawing>
+          <wp:inline distT="0" distB="0" distL="0" distR="0">
+            <wp:extent cx="5800000" cy="2751390"/>
+            <wp:effectExtent l="0" t="0" r="0" b="0"/>
+            <wp:docPr id="10" name="Figure 10" descr="Figure 4.10: Admission readiness estimator result for Computer Science."/>
+            <wp:cNvGraphicFramePr>
+              <a:graphicFrameLocks noChangeAspect="1"/>
+            </wp:cNvGraphicFramePr>
+            <a:graphic>
+              <a:graphicData uri="http://schemas.openxmlformats.org/drawingml/2006/picture">
+                <pic:pic>
+                  <pic:nvPicPr>
+                    <pic:cNvPr id="0" name="image10.png"/>
+                    <pic:cNvPicPr/>
+                  </pic:nvPicPr>
+                  <pic:blipFill>
+                    <a:blip r:embed="rIdImage10"/>
+                    <a:stretch>
+                      <a:fillRect/>
+                    </a:stretch>
+                  </pic:blipFill>
+                  <pic:spPr>
+                    <a:xfrm>
+                      <a:off x="0" y="0"/>
+                      <a:ext cx="5800000" cy="2751390"/>
+                    </a:xfrm>
+                    <a:prstGeom prst="rect">
+                      <a:avLst/>
+                    </a:prstGeom>
+                  </pic:spPr>
+                </pic:pic>
+              </a:graphicData>
+            </a:graphic>
+          </wp:inline>
+        </w:drawing>
+      </w:r>
+    </w:p>
+    <w:p>
+      <w:r>
+        <w:rPr>
+          <w:b/>
+          <w:rFonts w:ascii="Times New Roman" w:hAnsi="Times New Roman"/>
+          <w:sz w:val="24"/>
+        </w:rPr>
+        <w:t xml:space="preserve">Figure 4.10: Admission readiness estimator result for Computer Science.</w:t>
+      </w:r>
+    </w:p>
+    <w:p/>
+    <w:p>
+      <w:r>
+        <w:drawing>
+          <wp:inline distT="0" distB="0" distL="0" distR="0">
+            <wp:extent cx="5800000" cy="2742898"/>
+            <wp:effectExtent l="0" t="0" r="0" b="0"/>
+            <wp:docPr id="11" name="Figure 11" descr="Figure 4.11: Admin curated knowledge library with approved entries."/>
+            <wp:cNvGraphicFramePr>
+              <a:graphicFrameLocks noChangeAspect="1"/>
+            </wp:cNvGraphicFramePr>
+            <a:graphic>
+              <a:graphicData uri="http://schemas.openxmlformats.org/drawingml/2006/picture">
+                <pic:pic>
+                  <pic:nvPicPr>
+                    <pic:cNvPr id="0" name="image11.png"/>
+                    <pic:cNvPicPr/>
+                  </pic:nvPicPr>
+                  <pic:blipFill>
+                    <a:blip r:embed="rIdImage11"/>
+                    <a:stretch>
+                      <a:fillRect/>
+                    </a:stretch>
+                  </pic:blipFill>
+                  <pic:spPr>
+                    <a:xfrm>
+                      <a:off x="0" y="0"/>
+                      <a:ext cx="5800000" cy="2742898"/>
+                    </a:xfrm>
+                    <a:prstGeom prst="rect">
+                      <a:avLst/>
+                    </a:prstGeom>
+                  </pic:spPr>
+                </pic:pic>
+              </a:graphicData>
+            </a:graphic>
+          </wp:inline>
+        </w:drawing>
+      </w:r>
+    </w:p>
+    <w:p>
+      <w:r>
+        <w:rPr>
+          <w:b/>
+          <w:rFonts w:ascii="Times New Roman" w:hAnsi="Times New Roman"/>
+          <w:sz w:val="24"/>
+        </w:rPr>
+        <w:t xml:space="preserve">Figure 4.11: Admin curated knowledge library with approved entries.</w:t>
+      </w:r>
+    </w:p>
+    <w:p/>
+    <w:p>
+      <w:r>
+        <w:drawing>
+          <wp:inline distT="0" distB="0" distL="0" distR="0">
+            <wp:extent cx="5799999" cy="906539"/>
+            <wp:effectExtent l="0" t="0" r="0" b="0"/>
+            <wp:docPr id="12" name="Figure 12" descr="Figure 4.12: Backend health endpoint showing OpenAI Responses API mode."/>
+            <wp:cNvGraphicFramePr>
+              <a:graphicFrameLocks noChangeAspect="1"/>
+            </wp:cNvGraphicFramePr>
+            <a:graphic>
+              <a:graphicData uri="http://schemas.openxmlformats.org/drawingml/2006/picture">
+                <pic:pic>
+                  <pic:nvPicPr>
+                    <pic:cNvPr id="0" name="image12.png"/>
+                    <pic:cNvPicPr/>
+                  </pic:nvPicPr>
+                  <pic:blipFill>
+                    <a:blip r:embed="rIdImage12"/>
+                    <a:stretch>
+                      <a:fillRect/>
+                    </a:stretch>
+                  </pic:blipFill>
+                  <pic:spPr>
+                    <a:xfrm>
+                      <a:off x="0" y="0"/>
+                      <a:ext cx="5799999" cy="906539"/>
+                    </a:xfrm>
+                    <a:prstGeom prst="rect">
+                      <a:avLst/>
+                    </a:prstGeom>
+                  </pic:spPr>
+                </pic:pic>
+              </a:graphicData>
+            </a:graphic>
+          </wp:inline>
+        </w:drawing>
+      </w:r>
+    </w:p>
+    <w:p>
+      <w:r>
+        <w:rPr>
+          <w:b/>
+          <w:rFonts w:ascii="Times New Roman" w:hAnsi="Times New Roman"/>
+          <w:sz w:val="24"/>
+        </w:rPr>
+        <w:t xml:space="preserve">Figure 4.12: Backend health endpoint showing OpenAI Responses API mode.</w:t>
+      </w:r>
+    </w:p>
     <w:p/>
     <w:p>
       <w:pPr>
@@ -8120,6 +9461,96 @@
           </w:p>
         </w:tc>
       </w:tr>
+      <w:tr>
+        <w:tc>
+          <w:tcPr>
+            <w:tcW w:w="2400" w:type="dxa"/>
+          </w:tcPr>
+          <w:p>
+            <w:r>
+              <w:rPr>
+                <w:rFonts w:ascii="Times New Roman" w:hAnsi="Times New Roman"/>
+                <w:sz w:val="24"/>
+              </w:rPr>
+              <w:t xml:space="preserve">Upload-assisted chat test</w:t>
+            </w:r>
+          </w:p>
+        </w:tc>
+        <w:tc>
+          <w:tcPr>
+            <w:tcW w:w="2400" w:type="dxa"/>
+          </w:tcPr>
+          <w:p>
+            <w:r>
+              <w:rPr>
+                <w:rFonts w:ascii="Times New Roman" w:hAnsi="Times New Roman"/>
+                <w:sz w:val="24"/>
+              </w:rPr>
+              <w:t xml:space="preserve">Confirm Eve can use an uploaded note as private question context.</w:t>
+            </w:r>
+          </w:p>
+        </w:tc>
+      </w:tr>
+      <w:tr>
+        <w:tc>
+          <w:tcPr>
+            <w:tcW w:w="2400" w:type="dxa"/>
+          </w:tcPr>
+          <w:p>
+            <w:r>
+              <w:rPr>
+                <w:rFonts w:ascii="Times New Roman" w:hAnsi="Times New Roman"/>
+                <w:sz w:val="24"/>
+              </w:rPr>
+              <w:t xml:space="preserve">Peer-note moderation test</w:t>
+            </w:r>
+          </w:p>
+        </w:tc>
+        <w:tc>
+          <w:tcPr>
+            <w:tcW w:w="2400" w:type="dxa"/>
+          </w:tcPr>
+          <w:p>
+            <w:r>
+              <w:rPr>
+                <w:rFonts w:ascii="Times New Roman" w:hAnsi="Times New Roman"/>
+                <w:sz w:val="24"/>
+              </w:rPr>
+              <w:t xml:space="preserve">Confirm student notes require review before shared use.</w:t>
+            </w:r>
+          </w:p>
+        </w:tc>
+      </w:tr>
+      <w:tr>
+        <w:tc>
+          <w:tcPr>
+            <w:tcW w:w="2400" w:type="dxa"/>
+          </w:tcPr>
+          <w:p>
+            <w:r>
+              <w:rPr>
+                <w:rFonts w:ascii="Times New Roman" w:hAnsi="Times New Roman"/>
+                <w:sz w:val="24"/>
+              </w:rPr>
+              <w:t xml:space="preserve">Knowledge governance test</w:t>
+            </w:r>
+          </w:p>
+        </w:tc>
+        <w:tc>
+          <w:tcPr>
+            <w:tcW w:w="2400" w:type="dxa"/>
+          </w:tcPr>
+          <w:p>
+            <w:r>
+              <w:rPr>
+                <w:rFonts w:ascii="Times New Roman" w:hAnsi="Times New Roman"/>
+                <w:sz w:val="24"/>
+              </w:rPr>
+              <w:t xml:space="preserve">Confirm admin knowledge entries and audit labels are available.</w:t>
+            </w:r>
+          </w:p>
+        </w:tc>
+      </w:tr>
     </w:tbl>
     <w:p/>
     <w:p>
@@ -9643,476 +11074,15 @@
     <w:p/>
     <w:p>
       <w:pPr>
-        <w:pStyle w:val="Heading2"/>
-      </w:pPr>
-      <w:r>
-        <w:rPr>
-          <w:b/>
-          <w:rFonts w:ascii="Times New Roman" w:hAnsi="Times New Roman"/>
-          <w:sz w:val="24"/>
-        </w:rPr>
-        <w:t xml:space="preserve">4.7 Model Training and Evaluation</w:t>
-      </w:r>
-    </w:p>
-    <w:p/>
-    <w:p>
-      <w:r>
-        <w:rPr>
-          <w:rFonts w:ascii="Times New Roman" w:hAnsi="Times New Roman"/>
-          <w:sz w:val="24"/>
-        </w:rPr>
-        <w:t xml:space="preserve">The prototype does not train a new large language model from scratch. Instead, it uses:</w:t>
-      </w:r>
-    </w:p>
-    <w:p/>
-    <w:p>
-      <w:r>
-        <w:rPr>
-          <w:rFonts w:ascii="Times New Roman" w:hAnsi="Times New Roman"/>
-          <w:sz w:val="24"/>
-        </w:rPr>
-        <w:t xml:space="preserve">• a curated ESUI knowledge base;</w:t>
-      </w:r>
-    </w:p>
-    <w:p>
-      <w:r>
-        <w:rPr>
-          <w:rFonts w:ascii="Times New Roman" w:hAnsi="Times New Roman"/>
-          <w:sz w:val="24"/>
-        </w:rPr>
-        <w:t xml:space="preserve">• deterministic local academic logic;</w:t>
-      </w:r>
-    </w:p>
-    <w:p>
-      <w:r>
-        <w:rPr>
-          <w:rFonts w:ascii="Times New Roman" w:hAnsi="Times New Roman"/>
-          <w:sz w:val="24"/>
-        </w:rPr>
-        <w:t xml:space="preserve">• RAG-style retrieval;</w:t>
-      </w:r>
-    </w:p>
-    <w:p>
-      <w:r>
-        <w:rPr>
-          <w:rFonts w:ascii="Times New Roman" w:hAnsi="Times New Roman"/>
-          <w:sz w:val="24"/>
-        </w:rPr>
-        <w:t xml:space="preserve">• optional OpenAI response generation;</w:t>
-      </w:r>
-    </w:p>
-    <w:p>
-      <w:r>
-        <w:rPr>
-          <w:rFonts w:ascii="Times New Roman" w:hAnsi="Times New Roman"/>
-          <w:sz w:val="24"/>
-        </w:rPr>
-        <w:t xml:space="preserve">• scoring logic for guided learning sessions.</w:t>
-      </w:r>
-    </w:p>
-    <w:p/>
-    <w:p>
-      <w:r>
-        <w:rPr>
-          <w:rFonts w:ascii="Times New Roman" w:hAnsi="Times New Roman"/>
-          <w:sz w:val="24"/>
-        </w:rPr>
-        <w:t xml:space="preserve">This approach is appropriate for the prototype because training a large model would require large datasets, high computing resources, and institutional governance. RAG allows the system to use verified knowledge while reducing hallucination.</w:t>
-      </w:r>
-    </w:p>
-    <w:p/>
-    <w:p>
-      <w:r>
-        <w:rPr>
-          <w:rFonts w:ascii="Times New Roman" w:hAnsi="Times New Roman"/>
-          <w:sz w:val="24"/>
-        </w:rPr>
-        <w:t xml:space="preserve">Evaluation was performed through functional testing, response quality checks, role-based access tests, and guardrail tests.</w:t>
-      </w:r>
-    </w:p>
-    <w:p/>
-    <w:p>
-      <w:pPr>
-        <w:pStyle w:val="Heading2"/>
-      </w:pPr>
-      <w:r>
-        <w:rPr>
-          <w:b/>
-          <w:rFonts w:ascii="Times New Roman" w:hAnsi="Times New Roman"/>
-          <w:sz w:val="24"/>
-        </w:rPr>
-        <w:t xml:space="preserve">4.8 Experimental Results and Analysis</w:t>
-      </w:r>
-    </w:p>
-    <w:p/>
-    <w:p>
-      <w:r>
-        <w:rPr>
-          <w:rFonts w:ascii="Times New Roman" w:hAnsi="Times New Roman"/>
-          <w:sz w:val="24"/>
-        </w:rPr>
-        <w:t xml:space="preserve">The implemented prototype successfully demonstrated the main project goal. It was able to:</w:t>
-      </w:r>
-    </w:p>
-    <w:p/>
-    <w:p>
-      <w:r>
-        <w:rPr>
-          <w:rFonts w:ascii="Times New Roman" w:hAnsi="Times New Roman"/>
-          <w:sz w:val="24"/>
-        </w:rPr>
-        <w:t xml:space="preserve">• support role-based guest, student, and lecturer modes;</w:t>
-      </w:r>
-    </w:p>
-    <w:p>
-      <w:r>
-        <w:rPr>
-          <w:rFonts w:ascii="Times New Roman" w:hAnsi="Times New Roman"/>
-          <w:sz w:val="24"/>
-        </w:rPr>
-        <w:t xml:space="preserve">• provide public ESUI guidance;</w:t>
-      </w:r>
-    </w:p>
-    <w:p>
-      <w:r>
-        <w:rPr>
-          <w:rFonts w:ascii="Times New Roman" w:hAnsi="Times New Roman"/>
-          <w:sz w:val="24"/>
-        </w:rPr>
-        <w:t xml:space="preserve">• estimate admission readiness;</w:t>
-      </w:r>
-    </w:p>
-    <w:p>
-      <w:r>
-        <w:rPr>
-          <w:rFonts w:ascii="Times New Roman" w:hAnsi="Times New Roman"/>
-          <w:sz w:val="24"/>
-        </w:rPr>
-        <w:t xml:space="preserve">• identify student weak topics;</w:t>
-      </w:r>
-    </w:p>
-    <w:p>
-      <w:r>
-        <w:rPr>
-          <w:rFonts w:ascii="Times New Roman" w:hAnsi="Times New Roman"/>
-          <w:sz w:val="24"/>
-        </w:rPr>
-        <w:t xml:space="preserve">• recommend personalized study tasks;</w:t>
-      </w:r>
-    </w:p>
-    <w:p>
-      <w:r>
-        <w:rPr>
-          <w:rFonts w:ascii="Times New Roman" w:hAnsi="Times New Roman"/>
-          <w:sz w:val="24"/>
-        </w:rPr>
-        <w:t xml:space="preserve">• start guided learning sessions;</w:t>
-      </w:r>
-    </w:p>
-    <w:p>
-      <w:r>
-        <w:rPr>
-          <w:rFonts w:ascii="Times New Roman" w:hAnsi="Times New Roman"/>
-          <w:sz w:val="24"/>
-        </w:rPr>
-        <w:t xml:space="preserve">• score quiz answers;</w:t>
-      </w:r>
-    </w:p>
-    <w:p>
-      <w:r>
-        <w:rPr>
-          <w:rFonts w:ascii="Times New Roman" w:hAnsi="Times New Roman"/>
-          <w:sz w:val="24"/>
-        </w:rPr>
-        <w:t xml:space="preserve">• store learning progress in SQLite;</w:t>
-      </w:r>
-    </w:p>
-    <w:p>
-      <w:r>
-        <w:rPr>
-          <w:rFonts w:ascii="Times New Roman" w:hAnsi="Times New Roman"/>
-          <w:sz w:val="24"/>
-        </w:rPr>
-        <w:t xml:space="preserve">• show saved progress history;</w:t>
-      </w:r>
-    </w:p>
-    <w:p>
-      <w:r>
-        <w:rPr>
-          <w:rFonts w:ascii="Times New Roman" w:hAnsi="Times New Roman"/>
-          <w:sz w:val="24"/>
-        </w:rPr>
-        <w:t xml:space="preserve">• provide lecturer course-level learning trends;</w:t>
-      </w:r>
-    </w:p>
-    <w:p>
-      <w:r>
-        <w:rPr>
-          <w:rFonts w:ascii="Times New Roman" w:hAnsi="Times New Roman"/>
-          <w:sz w:val="24"/>
-        </w:rPr>
-        <w:t xml:space="preserve">• generate natural AI responses when OpenAI mode is configured;</w:t>
-      </w:r>
-    </w:p>
-    <w:p>
-      <w:r>
-        <w:rPr>
-          <w:rFonts w:ascii="Times New Roman" w:hAnsi="Times New Roman"/>
-          <w:sz w:val="24"/>
-        </w:rPr>
-        <w:t xml:space="preserve">• block unsafe or unauthorized requests.</w:t>
-      </w:r>
-    </w:p>
-    <w:p/>
-    <w:p>
-      <w:r>
-        <w:rPr>
-          <w:rFonts w:ascii="Times New Roman" w:hAnsi="Times New Roman"/>
-          <w:sz w:val="24"/>
-        </w:rPr>
-        <w:t xml:space="preserve">The saved MTH 211 session showed how a student's activity can become progress evidence. The lecturer dashboard then reused that saved learning history as course-level teaching insight.</w:t>
-      </w:r>
-    </w:p>
-    <w:p/>
-    <w:p>
-      <w:pPr>
-        <w:pStyle w:val="Heading2"/>
-      </w:pPr>
-      <w:r>
-        <w:rPr>
-          <w:b/>
-          <w:rFonts w:ascii="Times New Roman" w:hAnsi="Times New Roman"/>
-          <w:sz w:val="24"/>
-        </w:rPr>
-        <w:t xml:space="preserve">4.9 Performance Evaluation</w:t>
-      </w:r>
-    </w:p>
-    <w:p/>
-    <w:p>
-      <w:r>
-        <w:rPr>
-          <w:rFonts w:ascii="Times New Roman" w:hAnsi="Times New Roman"/>
-          <w:sz w:val="24"/>
-        </w:rPr>
-        <w:t xml:space="preserve">The system ran successfully in a local development environment. Flutter web returned HTTP 200 on http://127.0.0.1:8011, and the backend responded on http://127.0.0.1:8010.</w:t>
-      </w:r>
-    </w:p>
-    <w:p/>
-    <w:p>
-      <w:r>
-        <w:rPr>
-          <w:rFonts w:ascii="Times New Roman" w:hAnsi="Times New Roman"/>
-          <w:sz w:val="24"/>
-        </w:rPr>
-        <w:t xml:space="preserve">The system uses lightweight JSON and SQLite storage, which is suitable for prototype demonstration. In production, performance can be improved by using a managed database, caching, vector search, asynchronous workers, and institution-hosted infrastructure.</w:t>
-      </w:r>
-    </w:p>
-    <w:p/>
-    <w:p>
-      <w:pPr>
-        <w:pStyle w:val="Heading2"/>
-      </w:pPr>
-      <w:r>
-        <w:rPr>
-          <w:b/>
-          <w:rFonts w:ascii="Times New Roman" w:hAnsi="Times New Roman"/>
-          <w:sz w:val="24"/>
-        </w:rPr>
-        <w:t xml:space="preserve">4.10 Discussion of Results</w:t>
-      </w:r>
-    </w:p>
-    <w:p/>
-    <w:p>
-      <w:r>
-        <w:rPr>
-          <w:rFonts w:ascii="Times New Roman" w:hAnsi="Times New Roman"/>
-          <w:sz w:val="24"/>
-        </w:rPr>
-        <w:t xml:space="preserve">The results show that Eve is more than a chatbot. It implements the core requirements of personalized learning and academic progress tracking. The student module identifies weak topics and tracks improvement through saved quiz sessions. The lecturer module converts saved student learning activity into course-level intervention insight. The guest module supports admissions and public inquiry functions.</w:t>
-      </w:r>
-    </w:p>
-    <w:p/>
-    <w:p>
-      <w:r>
-        <w:rPr>
-          <w:rFonts w:ascii="Times New Roman" w:hAnsi="Times New Roman"/>
-          <w:sz w:val="24"/>
-        </w:rPr>
-        <w:t xml:space="preserve">The use of guardrails and role-based access control addresses privacy and cybersecurity concerns. The OpenAI integration improves response quality, while local fallback logic ensures that the system can still operate when external AI access is unavailable.</w:t>
-      </w:r>
-    </w:p>
-    <w:p/>
-    <w:p>
-      <w:r>
-        <w:rPr>
-          <w:rFonts w:ascii="Times New Roman" w:hAnsi="Times New Roman"/>
-          <w:sz w:val="24"/>
-        </w:rPr>
-        <w:t xml:space="preserve">The prototype is limited by its use of sample data. However, its architecture can be extended to real university systems through secure APIs, identity management, approved course materials, and managed database storage.</w:t>
-      </w:r>
-    </w:p>
-    <w:p/>
-    <w:p>
-      <w:pPr>
-        <w:pStyle w:val="Heading2"/>
-      </w:pPr>
-      <w:r>
-        <w:rPr>
-          <w:b/>
-          <w:rFonts w:ascii="Times New Roman" w:hAnsi="Times New Roman"/>
-          <w:sz w:val="24"/>
-        </w:rPr>
-        <w:t xml:space="preserve">4.11 Summary of the Chapter</w:t>
-      </w:r>
-    </w:p>
-    <w:p/>
-    <w:p>
-      <w:r>
-        <w:rPr>
-          <w:rFonts w:ascii="Times New Roman" w:hAnsi="Times New Roman"/>
-          <w:sz w:val="24"/>
-        </w:rPr>
-        <w:t xml:space="preserve">This chapter presented the implementation and testing of Eve. It described the development environment, backend and frontend modules, interface screens, test plan, test results, AI evaluation approach, and discussion of results. The implementation confirms that the project topic was achieved through a working system for personalized learning, academic progress tracking, guided learning sessions, and lecturer analytics.</w:t>
-      </w:r>
-    </w:p>
-    <w:p/>
-    <w:p>
-      <w:pPr>
-        <w:pStyle w:val="Heading1"/>
-      </w:pPr>
-      <w:r>
-        <w:rPr>
-          <w:b/>
-          <w:rFonts w:ascii="Times New Roman" w:hAnsi="Times New Roman"/>
-          <w:sz w:val="24"/>
-        </w:rPr>
-        <w:t xml:space="preserve">CHAPTER FIVE</w:t>
-      </w:r>
-    </w:p>
-    <w:p/>
-    <w:p>
-      <w:pPr>
-        <w:pStyle w:val="Heading1"/>
-      </w:pPr>
-      <w:r>
-        <w:rPr>
-          <w:b/>
-          <w:rFonts w:ascii="Times New Roman" w:hAnsi="Times New Roman"/>
-          <w:sz w:val="24"/>
-        </w:rPr>
-        <w:t xml:space="preserve">SUMMARY, CONCLUSION AND RECOMMENDATIONS</w:t>
-      </w:r>
-    </w:p>
-    <w:p/>
-    <w:p>
-      <w:pPr>
-        <w:pStyle w:val="Heading2"/>
-      </w:pPr>
-      <w:r>
-        <w:rPr>
-          <w:b/>
-          <w:rFonts w:ascii="Times New Roman" w:hAnsi="Times New Roman"/>
-          <w:sz w:val="24"/>
-        </w:rPr>
-        <w:t xml:space="preserve">5.1 Introduction to the Chapter</w:t>
-      </w:r>
-    </w:p>
-    <w:p/>
-    <w:p>
-      <w:r>
-        <w:rPr>
-          <w:rFonts w:ascii="Times New Roman" w:hAnsi="Times New Roman"/>
-          <w:sz w:val="24"/>
-        </w:rPr>
-        <w:t xml:space="preserve">This chapter presents the summary, conclusion, recommendations, limitations, future work, and AI-use disclosure for the project topic: Design and implementation of an ai system for personalized learning and academic progress tracking.</w:t>
-      </w:r>
-    </w:p>
-    <w:p/>
-    <w:p>
-      <w:r>
-        <w:rPr>
-          <w:rFonts w:ascii="Times New Roman" w:hAnsi="Times New Roman"/>
-          <w:sz w:val="24"/>
-        </w:rPr>
-        <w:t xml:space="preserve">The chapter reviews what was achieved in the study and explains how the implemented system addresses the identified problem.</w:t>
-      </w:r>
-    </w:p>
-    <w:p/>
-    <w:p>
-      <w:pPr>
-        <w:pStyle w:val="Heading2"/>
-      </w:pPr>
-      <w:r>
-        <w:rPr>
-          <w:b/>
-          <w:rFonts w:ascii="Times New Roman" w:hAnsi="Times New Roman"/>
-          <w:sz w:val="24"/>
-        </w:rPr>
-        <w:t xml:space="preserve">5.2 Summary of the Study</w:t>
-      </w:r>
-    </w:p>
-    <w:p/>
-    <w:p>
-      <w:r>
-        <w:rPr>
-          <w:rFonts w:ascii="Times New Roman" w:hAnsi="Times New Roman"/>
-          <w:sz w:val="24"/>
-        </w:rPr>
-        <w:t xml:space="preserve">The study focused on the design and implementation of an AI system that supports personalized learning and academic progress tracking for Edo State University Iyamho. The system, named Eve, was developed as a role-aware academic companion for prospective candidates, current students, and lecturers.</w:t>
-      </w:r>
-    </w:p>
-    <w:p/>
-    <w:p>
-      <w:r>
-        <w:rPr>
-          <w:rFonts w:ascii="Times New Roman" w:hAnsi="Times New Roman"/>
-          <w:sz w:val="24"/>
-        </w:rPr>
-        <w:t xml:space="preserve">The project began with the problem that academic guidance, course support, admission information, and progress tracking are often spread across different sources. Students may need support with weak topics, study planning, mock tests, and academic improvement, while lecturers may need course-level insights for teaching intervention. Generic AI chatbots are not sufficient because they may lack institutional grounding, privacy controls, and role-based access.</w:t>
-      </w:r>
-    </w:p>
-    <w:p/>
-    <w:p>
-      <w:r>
-        <w:rPr>
-          <w:rFonts w:ascii="Times New Roman" w:hAnsi="Times New Roman"/>
-          <w:sz w:val="24"/>
-        </w:rPr>
-        <w:t xml:space="preserve">To address the problem, Eve was built with a Flutter frontend and a Python FastAPI backend. The backend includes RAG retrieval, prompt-injection guardrails, role-based access control, student learning-profile computation, guided learning sessions, quiz scoring, SQLite progress persistence, lecturer assigned-course analytics, admission readiness estimation, and optional OpenAI response generation.</w:t>
-      </w:r>
-    </w:p>
-    <w:p/>
-    <w:p>
-      <w:r>
-        <w:rPr>
-          <w:rFonts w:ascii="Times New Roman" w:hAnsi="Times New Roman"/>
-          <w:sz w:val="24"/>
-        </w:rPr>
-        <w:t xml:space="preserve">The implemented system demonstrates that AI can be used as an institutional academic-support layer when combined with verified knowledge, structured academic data, saved progress history, and privacy-aware controls.</w:t>
-      </w:r>
-    </w:p>
-    <w:p/>
-    <w:p>
-      <w:pPr>
-        <w:pStyle w:val="Heading2"/>
-      </w:pPr>
-      <w:r>
-        <w:rPr>
-          <w:b/>
-          <w:rFonts w:ascii="Times New Roman" w:hAnsi="Times New Roman"/>
-          <w:sz w:val="24"/>
-        </w:rPr>
-        <w:t xml:space="preserve">5.3 Achievement of Objectives</w:t>
-      </w:r>
-    </w:p>
-    <w:p/>
-    <w:p>
-      <w:r>
-        <w:rPr>
-          <w:rFonts w:ascii="Times New Roman" w:hAnsi="Times New Roman"/>
-          <w:sz w:val="24"/>
-        </w:rPr>
-        <w:t xml:space="preserve">The project objectives were achieved as follows:</w:t>
+        <w:pStyle w:val="Heading3"/>
+      </w:pPr>
+      <w:r>
+        <w:rPr>
+          <w:b/>
+          <w:rFonts w:ascii="Times New Roman" w:hAnsi="Times New Roman"/>
+          <w:sz w:val="24"/>
+        </w:rPr>
+        <w:t xml:space="preserve">4.6.10 Upload-Assisted Ask Eve Test</w:t>
       </w:r>
     </w:p>
     <w:p/>
@@ -10139,21 +11109,35 @@
                 <w:rFonts w:ascii="Times New Roman" w:hAnsi="Times New Roman"/>
                 <w:sz w:val="24"/>
               </w:rPr>
-              <w:t xml:space="preserve">Objective</w:t>
-            </w:r>
-          </w:p>
-        </w:tc>
-        <w:tc>
-          <w:tcPr>
-            <w:tcW w:w="2400" w:type="dxa"/>
-          </w:tcPr>
-          <w:p>
-            <w:r>
-              <w:rPr>
-                <w:rFonts w:ascii="Times New Roman" w:hAnsi="Times New Roman"/>
-                <w:sz w:val="24"/>
-              </w:rPr>
-              <w:t xml:space="preserve">Achievement</w:t>
+              <w:t xml:space="preserve">Test</w:t>
+            </w:r>
+          </w:p>
+        </w:tc>
+        <w:tc>
+          <w:tcPr>
+            <w:tcW w:w="2400" w:type="dxa"/>
+          </w:tcPr>
+          <w:p>
+            <w:r>
+              <w:rPr>
+                <w:rFonts w:ascii="Times New Roman" w:hAnsi="Times New Roman"/>
+                <w:sz w:val="24"/>
+              </w:rPr>
+              <w:t xml:space="preserve">Expected Result</w:t>
+            </w:r>
+          </w:p>
+        </w:tc>
+        <w:tc>
+          <w:tcPr>
+            <w:tcW w:w="2400" w:type="dxa"/>
+          </w:tcPr>
+          <w:p>
+            <w:r>
+              <w:rPr>
+                <w:rFonts w:ascii="Times New Roman" w:hAnsi="Times New Roman"/>
+                <w:sz w:val="24"/>
+              </w:rPr>
+              <w:t xml:space="preserve">Actual Result</w:t>
             </w:r>
           </w:p>
         </w:tc>
@@ -10169,21 +11153,107 @@
                 <w:rFonts w:ascii="Times New Roman" w:hAnsi="Times New Roman"/>
                 <w:sz w:val="24"/>
               </w:rPr>
-              <w:t xml:space="preserve">Design a responsive AI system interface</w:t>
-            </w:r>
-          </w:p>
-        </w:tc>
-        <w:tc>
-          <w:tcPr>
-            <w:tcW w:w="2400" w:type="dxa"/>
-          </w:tcPr>
-          <w:p>
-            <w:r>
-              <w:rPr>
-                <w:rFonts w:ascii="Times New Roman" w:hAnsi="Times New Roman"/>
-                <w:sz w:val="24"/>
-              </w:rPr>
-              <w:t xml:space="preserve">A Flutter web/mobile interface was implemented with guest, student, lecturer, chat, tools, admission, and profile screens.</w:t>
+              <w:t xml:space="preserve">Upload a CSC note and ask Eve for explanation</w:t>
+            </w:r>
+          </w:p>
+        </w:tc>
+        <w:tc>
+          <w:tcPr>
+            <w:tcW w:w="2400" w:type="dxa"/>
+          </w:tcPr>
+          <w:p>
+            <w:r>
+              <w:rPr>
+                <w:rFonts w:ascii="Times New Roman" w:hAnsi="Times New Roman"/>
+                <w:sz w:val="24"/>
+              </w:rPr>
+              <w:t xml:space="preserve">Eve should use the uploaded note as context for the current question</w:t>
+            </w:r>
+          </w:p>
+        </w:tc>
+        <w:tc>
+          <w:tcPr>
+            <w:tcW w:w="2400" w:type="dxa"/>
+          </w:tcPr>
+          <w:p>
+            <w:r>
+              <w:rPr>
+                <w:rFonts w:ascii="Times New Roman" w:hAnsi="Times New Roman"/>
+                <w:sz w:val="24"/>
+              </w:rPr>
+              <w:t xml:space="preserve">Passed</w:t>
+            </w:r>
+          </w:p>
+        </w:tc>
+      </w:tr>
+    </w:tbl>
+    <w:p/>
+    <w:p>
+      <w:pPr>
+        <w:pStyle w:val="Heading3"/>
+      </w:pPr>
+      <w:r>
+        <w:rPr>
+          <w:b/>
+          <w:rFonts w:ascii="Times New Roman" w:hAnsi="Times New Roman"/>
+          <w:sz w:val="24"/>
+        </w:rPr>
+        <w:t xml:space="preserve">4.6.11 Peer-Note Moderation Test</w:t>
+      </w:r>
+    </w:p>
+    <w:p/>
+    <w:tbl>
+      <w:tblPr>
+        <w:tblW w:w="0" w:type="auto"/>
+        <w:tblBorders>
+          <w:top w:val="single" w:sz="4"/>
+          <w:left w:val="single" w:sz="4"/>
+          <w:bottom w:val="single" w:sz="4"/>
+          <w:right w:val="single" w:sz="4"/>
+          <w:insideH w:val="single" w:sz="4"/>
+          <w:insideV w:val="single" w:sz="4"/>
+        </w:tblBorders>
+      </w:tblPr>
+      <w:tr>
+        <w:tc>
+          <w:tcPr>
+            <w:tcW w:w="2400" w:type="dxa"/>
+          </w:tcPr>
+          <w:p>
+            <w:r>
+              <w:rPr>
+                <w:rFonts w:ascii="Times New Roman" w:hAnsi="Times New Roman"/>
+                <w:sz w:val="24"/>
+              </w:rPr>
+              <w:t xml:space="preserve">Test</w:t>
+            </w:r>
+          </w:p>
+        </w:tc>
+        <w:tc>
+          <w:tcPr>
+            <w:tcW w:w="2400" w:type="dxa"/>
+          </w:tcPr>
+          <w:p>
+            <w:r>
+              <w:rPr>
+                <w:rFonts w:ascii="Times New Roman" w:hAnsi="Times New Roman"/>
+                <w:sz w:val="24"/>
+              </w:rPr>
+              <w:t xml:space="preserve">Expected Result</w:t>
+            </w:r>
+          </w:p>
+        </w:tc>
+        <w:tc>
+          <w:tcPr>
+            <w:tcW w:w="2400" w:type="dxa"/>
+          </w:tcPr>
+          <w:p>
+            <w:r>
+              <w:rPr>
+                <w:rFonts w:ascii="Times New Roman" w:hAnsi="Times New Roman"/>
+                <w:sz w:val="24"/>
+              </w:rPr>
+              <w:t xml:space="preserve">Actual Result</w:t>
             </w:r>
           </w:p>
         </w:tc>
@@ -10199,21 +11269,35 @@
                 <w:rFonts w:ascii="Times New Roman" w:hAnsi="Times New Roman"/>
                 <w:sz w:val="24"/>
               </w:rPr>
-              <w:t xml:space="preserve">Implement personalized academic support for students</w:t>
-            </w:r>
-          </w:p>
-        </w:tc>
-        <w:tc>
-          <w:tcPr>
-            <w:tcW w:w="2400" w:type="dxa"/>
-          </w:tcPr>
-          <w:p>
-            <w:r>
-              <w:rPr>
-                <w:rFonts w:ascii="Times New Roman" w:hAnsi="Times New Roman"/>
-                <w:sz w:val="24"/>
-              </w:rPr>
-              <w:t xml:space="preserve">The student module analyzes course records, weak topics, risk levels, timetable data, and saved quiz performance.</w:t>
+              <w:t xml:space="preserve">Student submits course note</w:t>
+            </w:r>
+          </w:p>
+        </w:tc>
+        <w:tc>
+          <w:tcPr>
+            <w:tcW w:w="2400" w:type="dxa"/>
+          </w:tcPr>
+          <w:p>
+            <w:r>
+              <w:rPr>
+                <w:rFonts w:ascii="Times New Roman" w:hAnsi="Times New Roman"/>
+                <w:sz w:val="24"/>
+              </w:rPr>
+              <w:t xml:space="preserve">Note should appear as pending review</w:t>
+            </w:r>
+          </w:p>
+        </w:tc>
+        <w:tc>
+          <w:tcPr>
+            <w:tcW w:w="2400" w:type="dxa"/>
+          </w:tcPr>
+          <w:p>
+            <w:r>
+              <w:rPr>
+                <w:rFonts w:ascii="Times New Roman" w:hAnsi="Times New Roman"/>
+                <w:sz w:val="24"/>
+              </w:rPr>
+              <w:t xml:space="preserve">Passed</w:t>
             </w:r>
           </w:p>
         </w:tc>
@@ -10229,21 +11313,35 @@
                 <w:rFonts w:ascii="Times New Roman" w:hAnsi="Times New Roman"/>
                 <w:sz w:val="24"/>
               </w:rPr>
-              <w:t xml:space="preserve">Implement academic progress tracking</w:t>
-            </w:r>
-          </w:p>
-        </w:tc>
-        <w:tc>
-          <w:tcPr>
-            <w:tcW w:w="2400" w:type="dxa"/>
-          </w:tcPr>
-          <w:p>
-            <w:r>
-              <w:rPr>
-                <w:rFonts w:ascii="Times New Roman" w:hAnsi="Times New Roman"/>
-                <w:sz w:val="24"/>
-              </w:rPr>
-              <w:t xml:space="preserve">Eve tracks overall progress, priority course, weak topics, completed learning sessions, quiz scores, and feedback history.</w:t>
+              <w:t xml:space="preserve">Lecturer reviews assigned-course note</w:t>
+            </w:r>
+          </w:p>
+        </w:tc>
+        <w:tc>
+          <w:tcPr>
+            <w:tcW w:w="2400" w:type="dxa"/>
+          </w:tcPr>
+          <w:p>
+            <w:r>
+              <w:rPr>
+                <w:rFonts w:ascii="Times New Roman" w:hAnsi="Times New Roman"/>
+                <w:sz w:val="24"/>
+              </w:rPr>
+              <w:t xml:space="preserve">Lecturer should approve, reject, or request revision</w:t>
+            </w:r>
+          </w:p>
+        </w:tc>
+        <w:tc>
+          <w:tcPr>
+            <w:tcW w:w="2400" w:type="dxa"/>
+          </w:tcPr>
+          <w:p>
+            <w:r>
+              <w:rPr>
+                <w:rFonts w:ascii="Times New Roman" w:hAnsi="Times New Roman"/>
+                <w:sz w:val="24"/>
+              </w:rPr>
+              <w:t xml:space="preserve">Passed</w:t>
             </w:r>
           </w:p>
         </w:tc>
@@ -10259,21 +11357,107 @@
                 <w:rFonts w:ascii="Times New Roman" w:hAnsi="Times New Roman"/>
                 <w:sz w:val="24"/>
               </w:rPr>
-              <w:t xml:space="preserve">Generate personalized learning plans</w:t>
-            </w:r>
-          </w:p>
-        </w:tc>
-        <w:tc>
-          <w:tcPr>
-            <w:tcW w:w="2400" w:type="dxa"/>
-          </w:tcPr>
-          <w:p>
-            <w:r>
-              <w:rPr>
-                <w:rFonts w:ascii="Times New Roman" w:hAnsi="Times New Roman"/>
-                <w:sz w:val="24"/>
-              </w:rPr>
-              <w:t xml:space="preserve">The system recommends weekly learning tasks, priority-course sessions, and study milestones.</w:t>
+              <w:t xml:space="preserve">Approved note is retrieved by Eve</w:t>
+            </w:r>
+          </w:p>
+        </w:tc>
+        <w:tc>
+          <w:tcPr>
+            <w:tcW w:w="2400" w:type="dxa"/>
+          </w:tcPr>
+          <w:p>
+            <w:r>
+              <w:rPr>
+                <w:rFonts w:ascii="Times New Roman" w:hAnsi="Times New Roman"/>
+                <w:sz w:val="24"/>
+              </w:rPr>
+              <w:t xml:space="preserve">Approved note should be available as reviewed peer learning context</w:t>
+            </w:r>
+          </w:p>
+        </w:tc>
+        <w:tc>
+          <w:tcPr>
+            <w:tcW w:w="2400" w:type="dxa"/>
+          </w:tcPr>
+          <w:p>
+            <w:r>
+              <w:rPr>
+                <w:rFonts w:ascii="Times New Roman" w:hAnsi="Times New Roman"/>
+                <w:sz w:val="24"/>
+              </w:rPr>
+              <w:t xml:space="preserve">Passed</w:t>
+            </w:r>
+          </w:p>
+        </w:tc>
+      </w:tr>
+    </w:tbl>
+    <w:p/>
+    <w:p>
+      <w:pPr>
+        <w:pStyle w:val="Heading3"/>
+      </w:pPr>
+      <w:r>
+        <w:rPr>
+          <w:b/>
+          <w:rFonts w:ascii="Times New Roman" w:hAnsi="Times New Roman"/>
+          <w:sz w:val="24"/>
+        </w:rPr>
+        <w:t xml:space="preserve">4.6.12 Knowledge Governance Test</w:t>
+      </w:r>
+    </w:p>
+    <w:p/>
+    <w:tbl>
+      <w:tblPr>
+        <w:tblW w:w="0" w:type="auto"/>
+        <w:tblBorders>
+          <w:top w:val="single" w:sz="4"/>
+          <w:left w:val="single" w:sz="4"/>
+          <w:bottom w:val="single" w:sz="4"/>
+          <w:right w:val="single" w:sz="4"/>
+          <w:insideH w:val="single" w:sz="4"/>
+          <w:insideV w:val="single" w:sz="4"/>
+        </w:tblBorders>
+      </w:tblPr>
+      <w:tr>
+        <w:tc>
+          <w:tcPr>
+            <w:tcW w:w="2400" w:type="dxa"/>
+          </w:tcPr>
+          <w:p>
+            <w:r>
+              <w:rPr>
+                <w:rFonts w:ascii="Times New Roman" w:hAnsi="Times New Roman"/>
+                <w:sz w:val="24"/>
+              </w:rPr>
+              <w:t xml:space="preserve">Test</w:t>
+            </w:r>
+          </w:p>
+        </w:tc>
+        <w:tc>
+          <w:tcPr>
+            <w:tcW w:w="2400" w:type="dxa"/>
+          </w:tcPr>
+          <w:p>
+            <w:r>
+              <w:rPr>
+                <w:rFonts w:ascii="Times New Roman" w:hAnsi="Times New Roman"/>
+                <w:sz w:val="24"/>
+              </w:rPr>
+              <w:t xml:space="preserve">Expected Result</w:t>
+            </w:r>
+          </w:p>
+        </w:tc>
+        <w:tc>
+          <w:tcPr>
+            <w:tcW w:w="2400" w:type="dxa"/>
+          </w:tcPr>
+          <w:p>
+            <w:r>
+              <w:rPr>
+                <w:rFonts w:ascii="Times New Roman" w:hAnsi="Times New Roman"/>
+                <w:sz w:val="24"/>
+              </w:rPr>
+              <w:t xml:space="preserve">Actual Result</w:t>
             </w:r>
           </w:p>
         </w:tc>
@@ -10289,21 +11473,35 @@
                 <w:rFonts w:ascii="Times New Roman" w:hAnsi="Times New Roman"/>
                 <w:sz w:val="24"/>
               </w:rPr>
-              <w:t xml:space="preserve">Implement RAG with ESUI knowledge</w:t>
-            </w:r>
-          </w:p>
-        </w:tc>
-        <w:tc>
-          <w:tcPr>
-            <w:tcW w:w="2400" w:type="dxa"/>
-          </w:tcPr>
-          <w:p>
-            <w:r>
-              <w:rPr>
-                <w:rFonts w:ascii="Times New Roman" w:hAnsi="Times New Roman"/>
-                <w:sz w:val="24"/>
-              </w:rPr>
-              <w:t xml:space="preserve">The backend retrieves from a curated ESUI knowledge base and grounds public responses in approved context.</w:t>
+              <w:t xml:space="preserve">Admin adds knowledge entry</w:t>
+            </w:r>
+          </w:p>
+        </w:tc>
+        <w:tc>
+          <w:tcPr>
+            <w:tcW w:w="2400" w:type="dxa"/>
+          </w:tcPr>
+          <w:p>
+            <w:r>
+              <w:rPr>
+                <w:rFonts w:ascii="Times New Roman" w:hAnsi="Times New Roman"/>
+                <w:sz w:val="24"/>
+              </w:rPr>
+              <w:t xml:space="preserve">Entry should be saved with governance metadata</w:t>
+            </w:r>
+          </w:p>
+        </w:tc>
+        <w:tc>
+          <w:tcPr>
+            <w:tcW w:w="2400" w:type="dxa"/>
+          </w:tcPr>
+          <w:p>
+            <w:r>
+              <w:rPr>
+                <w:rFonts w:ascii="Times New Roman" w:hAnsi="Times New Roman"/>
+                <w:sz w:val="24"/>
+              </w:rPr>
+              <w:t xml:space="preserve">Passed</w:t>
             </w:r>
           </w:p>
         </w:tc>
@@ -10319,21 +11517,581 @@
                 <w:rFonts w:ascii="Times New Roman" w:hAnsi="Times New Roman"/>
                 <w:sz w:val="24"/>
               </w:rPr>
-              <w:t xml:space="preserve">Implement role-based access control</w:t>
-            </w:r>
-          </w:p>
-        </w:tc>
-        <w:tc>
-          <w:tcPr>
-            <w:tcW w:w="2400" w:type="dxa"/>
-          </w:tcPr>
-          <w:p>
-            <w:r>
-              <w:rPr>
-                <w:rFonts w:ascii="Times New Roman" w:hAnsi="Times New Roman"/>
-                <w:sz w:val="24"/>
-              </w:rPr>
-              <w:t xml:space="preserve">Guests, students, and lecturers receive different authorized data access.</w:t>
+              <w:t xml:space="preserve">Ask Eve about knowledge gaps</w:t>
+            </w:r>
+          </w:p>
+        </w:tc>
+        <w:tc>
+          <w:tcPr>
+            <w:tcW w:w="2400" w:type="dxa"/>
+          </w:tcPr>
+          <w:p>
+            <w:r>
+              <w:rPr>
+                <w:rFonts w:ascii="Times New Roman" w:hAnsi="Times New Roman"/>
+                <w:sz w:val="24"/>
+              </w:rPr>
+              <w:t xml:space="preserve">Eve should explain uncertainty and avoid unsupported claims</w:t>
+            </w:r>
+          </w:p>
+        </w:tc>
+        <w:tc>
+          <w:tcPr>
+            <w:tcW w:w="2400" w:type="dxa"/>
+          </w:tcPr>
+          <w:p>
+            <w:r>
+              <w:rPr>
+                <w:rFonts w:ascii="Times New Roman" w:hAnsi="Times New Roman"/>
+                <w:sz w:val="24"/>
+              </w:rPr>
+              <w:t xml:space="preserve">Passed</w:t>
+            </w:r>
+          </w:p>
+        </w:tc>
+      </w:tr>
+    </w:tbl>
+    <w:p/>
+    <w:p>
+      <w:pPr>
+        <w:pStyle w:val="Heading2"/>
+      </w:pPr>
+      <w:r>
+        <w:rPr>
+          <w:b/>
+          <w:rFonts w:ascii="Times New Roman" w:hAnsi="Times New Roman"/>
+          <w:sz w:val="24"/>
+        </w:rPr>
+        <w:t xml:space="preserve">4.7 Model Training and Evaluation</w:t>
+      </w:r>
+    </w:p>
+    <w:p/>
+    <w:p>
+      <w:r>
+        <w:rPr>
+          <w:rFonts w:ascii="Times New Roman" w:hAnsi="Times New Roman"/>
+          <w:sz w:val="24"/>
+        </w:rPr>
+        <w:t xml:space="preserve">The prototype does not train a new large language model from scratch. Instead, it uses:</w:t>
+      </w:r>
+    </w:p>
+    <w:p/>
+    <w:p>
+      <w:r>
+        <w:rPr>
+          <w:rFonts w:ascii="Times New Roman" w:hAnsi="Times New Roman"/>
+          <w:sz w:val="24"/>
+        </w:rPr>
+        <w:t xml:space="preserve">• a curated ESUI knowledge base;</w:t>
+      </w:r>
+    </w:p>
+    <w:p>
+      <w:r>
+        <w:rPr>
+          <w:rFonts w:ascii="Times New Roman" w:hAnsi="Times New Roman"/>
+          <w:sz w:val="24"/>
+        </w:rPr>
+        <w:t xml:space="preserve">• deterministic local academic logic;</w:t>
+      </w:r>
+    </w:p>
+    <w:p>
+      <w:r>
+        <w:rPr>
+          <w:rFonts w:ascii="Times New Roman" w:hAnsi="Times New Roman"/>
+          <w:sz w:val="24"/>
+        </w:rPr>
+        <w:t xml:space="preserve">• RAG-style retrieval;</w:t>
+      </w:r>
+    </w:p>
+    <w:p>
+      <w:r>
+        <w:rPr>
+          <w:rFonts w:ascii="Times New Roman" w:hAnsi="Times New Roman"/>
+          <w:sz w:val="24"/>
+        </w:rPr>
+        <w:t xml:space="preserve">• optional OpenAI response generation;</w:t>
+      </w:r>
+    </w:p>
+    <w:p>
+      <w:r>
+        <w:rPr>
+          <w:rFonts w:ascii="Times New Roman" w:hAnsi="Times New Roman"/>
+          <w:sz w:val="24"/>
+        </w:rPr>
+        <w:t xml:space="preserve">• scoring logic for guided learning sessions.</w:t>
+      </w:r>
+    </w:p>
+    <w:p/>
+    <w:p>
+      <w:r>
+        <w:rPr>
+          <w:rFonts w:ascii="Times New Roman" w:hAnsi="Times New Roman"/>
+          <w:sz w:val="24"/>
+        </w:rPr>
+        <w:t xml:space="preserve">This approach is appropriate for the prototype because training a large model would require large datasets, high computing resources, and institutional governance. RAG allows the system to use verified knowledge while reducing hallucination.</w:t>
+      </w:r>
+    </w:p>
+    <w:p/>
+    <w:p>
+      <w:r>
+        <w:rPr>
+          <w:rFonts w:ascii="Times New Roman" w:hAnsi="Times New Roman"/>
+          <w:sz w:val="24"/>
+        </w:rPr>
+        <w:t xml:space="preserve">Evaluation was performed through functional testing, response quality checks, role-based access tests, and guardrail tests.</w:t>
+      </w:r>
+    </w:p>
+    <w:p/>
+    <w:p>
+      <w:pPr>
+        <w:pStyle w:val="Heading2"/>
+      </w:pPr>
+      <w:r>
+        <w:rPr>
+          <w:b/>
+          <w:rFonts w:ascii="Times New Roman" w:hAnsi="Times New Roman"/>
+          <w:sz w:val="24"/>
+        </w:rPr>
+        <w:t xml:space="preserve">4.8 Experimental Results and Analysis</w:t>
+      </w:r>
+    </w:p>
+    <w:p/>
+    <w:p>
+      <w:r>
+        <w:rPr>
+          <w:rFonts w:ascii="Times New Roman" w:hAnsi="Times New Roman"/>
+          <w:sz w:val="24"/>
+        </w:rPr>
+        <w:t xml:space="preserve">The implemented prototype successfully demonstrated the main project goal. It was able to:</w:t>
+      </w:r>
+    </w:p>
+    <w:p/>
+    <w:p>
+      <w:r>
+        <w:rPr>
+          <w:rFonts w:ascii="Times New Roman" w:hAnsi="Times New Roman"/>
+          <w:sz w:val="24"/>
+        </w:rPr>
+        <w:t xml:space="preserve">• support role-based guest, student, and lecturer modes;</w:t>
+      </w:r>
+    </w:p>
+    <w:p>
+      <w:r>
+        <w:rPr>
+          <w:rFonts w:ascii="Times New Roman" w:hAnsi="Times New Roman"/>
+          <w:sz w:val="24"/>
+        </w:rPr>
+        <w:t xml:space="preserve">• provide public ESUI guidance;</w:t>
+      </w:r>
+    </w:p>
+    <w:p>
+      <w:r>
+        <w:rPr>
+          <w:rFonts w:ascii="Times New Roman" w:hAnsi="Times New Roman"/>
+          <w:sz w:val="24"/>
+        </w:rPr>
+        <w:t xml:space="preserve">• estimate admission readiness;</w:t>
+      </w:r>
+    </w:p>
+    <w:p>
+      <w:r>
+        <w:rPr>
+          <w:rFonts w:ascii="Times New Roman" w:hAnsi="Times New Roman"/>
+          <w:sz w:val="24"/>
+        </w:rPr>
+        <w:t xml:space="preserve">• identify student weak topics;</w:t>
+      </w:r>
+    </w:p>
+    <w:p>
+      <w:r>
+        <w:rPr>
+          <w:rFonts w:ascii="Times New Roman" w:hAnsi="Times New Roman"/>
+          <w:sz w:val="24"/>
+        </w:rPr>
+        <w:t xml:space="preserve">• recommend personalized study tasks;</w:t>
+      </w:r>
+    </w:p>
+    <w:p>
+      <w:r>
+        <w:rPr>
+          <w:rFonts w:ascii="Times New Roman" w:hAnsi="Times New Roman"/>
+          <w:sz w:val="24"/>
+        </w:rPr>
+        <w:t xml:space="preserve">• start guided learning sessions;</w:t>
+      </w:r>
+    </w:p>
+    <w:p>
+      <w:r>
+        <w:rPr>
+          <w:rFonts w:ascii="Times New Roman" w:hAnsi="Times New Roman"/>
+          <w:sz w:val="24"/>
+        </w:rPr>
+        <w:t xml:space="preserve">• score quiz answers;</w:t>
+      </w:r>
+    </w:p>
+    <w:p>
+      <w:r>
+        <w:rPr>
+          <w:rFonts w:ascii="Times New Roman" w:hAnsi="Times New Roman"/>
+          <w:sz w:val="24"/>
+        </w:rPr>
+        <w:t xml:space="preserve">• store learning progress in SQLite;</w:t>
+      </w:r>
+    </w:p>
+    <w:p>
+      <w:r>
+        <w:rPr>
+          <w:rFonts w:ascii="Times New Roman" w:hAnsi="Times New Roman"/>
+          <w:sz w:val="24"/>
+        </w:rPr>
+        <w:t xml:space="preserve">• show saved progress history;</w:t>
+      </w:r>
+    </w:p>
+    <w:p>
+      <w:r>
+        <w:rPr>
+          <w:rFonts w:ascii="Times New Roman" w:hAnsi="Times New Roman"/>
+          <w:sz w:val="24"/>
+        </w:rPr>
+        <w:t xml:space="preserve">• provide lecturer course-level learning trends;</w:t>
+      </w:r>
+    </w:p>
+    <w:p>
+      <w:r>
+        <w:rPr>
+          <w:rFonts w:ascii="Times New Roman" w:hAnsi="Times New Roman"/>
+          <w:sz w:val="24"/>
+        </w:rPr>
+        <w:t xml:space="preserve">• support upload-assisted questions using student-provided notes;</w:t>
+      </w:r>
+    </w:p>
+    <w:p>
+      <w:r>
+        <w:rPr>
+          <w:rFonts w:ascii="Times New Roman" w:hAnsi="Times New Roman"/>
+          <w:sz w:val="24"/>
+        </w:rPr>
+        <w:t xml:space="preserve">• allow moderated peer-note contribution and lecturer review;</w:t>
+      </w:r>
+    </w:p>
+    <w:p>
+      <w:r>
+        <w:rPr>
+          <w:rFonts w:ascii="Times New Roman" w:hAnsi="Times New Roman"/>
+          <w:sz w:val="24"/>
+        </w:rPr>
+        <w:t xml:space="preserve">• provide admin knowledge governance for curated information;</w:t>
+      </w:r>
+    </w:p>
+    <w:p>
+      <w:r>
+        <w:rPr>
+          <w:rFonts w:ascii="Times New Roman" w:hAnsi="Times New Roman"/>
+          <w:sz w:val="24"/>
+        </w:rPr>
+        <w:t xml:space="preserve">• generate natural AI responses when OpenAI mode is configured;</w:t>
+      </w:r>
+    </w:p>
+    <w:p>
+      <w:r>
+        <w:rPr>
+          <w:rFonts w:ascii="Times New Roman" w:hAnsi="Times New Roman"/>
+          <w:sz w:val="24"/>
+        </w:rPr>
+        <w:t xml:space="preserve">• block unsafe or unauthorized requests.</w:t>
+      </w:r>
+    </w:p>
+    <w:p/>
+    <w:p>
+      <w:r>
+        <w:rPr>
+          <w:rFonts w:ascii="Times New Roman" w:hAnsi="Times New Roman"/>
+          <w:sz w:val="24"/>
+        </w:rPr>
+        <w:t xml:space="preserve">The saved MTH 211 session showed how a student's activity can become progress evidence. The lecturer dashboard then reused that saved learning history as course-level teaching insight.</w:t>
+      </w:r>
+    </w:p>
+    <w:p/>
+    <w:p>
+      <w:pPr>
+        <w:pStyle w:val="Heading2"/>
+      </w:pPr>
+      <w:r>
+        <w:rPr>
+          <w:b/>
+          <w:rFonts w:ascii="Times New Roman" w:hAnsi="Times New Roman"/>
+          <w:sz w:val="24"/>
+        </w:rPr>
+        <w:t xml:space="preserve">4.9 Performance Evaluation</w:t>
+      </w:r>
+    </w:p>
+    <w:p/>
+    <w:p>
+      <w:r>
+        <w:rPr>
+          <w:rFonts w:ascii="Times New Roman" w:hAnsi="Times New Roman"/>
+          <w:sz w:val="24"/>
+        </w:rPr>
+        <w:t xml:space="preserve">The system ran successfully in a local development environment. Flutter web returned HTTP 200 on http://127.0.0.1:8011, and the backend responded on http://127.0.0.1:8010.</w:t>
+      </w:r>
+    </w:p>
+    <w:p/>
+    <w:p>
+      <w:r>
+        <w:rPr>
+          <w:rFonts w:ascii="Times New Roman" w:hAnsi="Times New Roman"/>
+          <w:sz w:val="24"/>
+        </w:rPr>
+        <w:t xml:space="preserve">The system uses lightweight JSON and SQLite storage, which is suitable for prototype demonstration. In production, performance can be improved by using a managed database, caching, vector search, asynchronous workers, and institution-hosted infrastructure.</w:t>
+      </w:r>
+    </w:p>
+    <w:p/>
+    <w:p>
+      <w:pPr>
+        <w:pStyle w:val="Heading2"/>
+      </w:pPr>
+      <w:r>
+        <w:rPr>
+          <w:b/>
+          <w:rFonts w:ascii="Times New Roman" w:hAnsi="Times New Roman"/>
+          <w:sz w:val="24"/>
+        </w:rPr>
+        <w:t xml:space="preserve">4.10 Discussion of Results</w:t>
+      </w:r>
+    </w:p>
+    <w:p/>
+    <w:p>
+      <w:r>
+        <w:rPr>
+          <w:rFonts w:ascii="Times New Roman" w:hAnsi="Times New Roman"/>
+          <w:sz w:val="24"/>
+        </w:rPr>
+        <w:t xml:space="preserve">The results show that Eve is more than a chatbot. It implements the core requirements of personalized learning and academic progress tracking. The student module identifies weak topics and tracks improvement through saved quiz sessions. The lecturer module converts saved student learning activity into course-level intervention insight. The guest module supports admissions and public inquiry functions.</w:t>
+      </w:r>
+    </w:p>
+    <w:p/>
+    <w:p>
+      <w:r>
+        <w:rPr>
+          <w:rFonts w:ascii="Times New Roman" w:hAnsi="Times New Roman"/>
+          <w:sz w:val="24"/>
+        </w:rPr>
+        <w:t xml:space="preserve">The use of guardrails and role-based access control addresses privacy and cybersecurity concerns. The OpenAI integration improves response quality, while local fallback logic ensures that the system can still operate when external AI access is unavailable.</w:t>
+      </w:r>
+    </w:p>
+    <w:p/>
+    <w:p>
+      <w:r>
+        <w:rPr>
+          <w:rFonts w:ascii="Times New Roman" w:hAnsi="Times New Roman"/>
+          <w:sz w:val="24"/>
+        </w:rPr>
+        <w:t xml:space="preserve">The prototype is limited by its use of sample data. However, its architecture can be extended to real university systems through secure APIs, identity management, approved course materials, and managed database storage.</w:t>
+      </w:r>
+    </w:p>
+    <w:p/>
+    <w:p>
+      <w:pPr>
+        <w:pStyle w:val="Heading2"/>
+      </w:pPr>
+      <w:r>
+        <w:rPr>
+          <w:b/>
+          <w:rFonts w:ascii="Times New Roman" w:hAnsi="Times New Roman"/>
+          <w:sz w:val="24"/>
+        </w:rPr>
+        <w:t xml:space="preserve">4.11 Summary of the Chapter</w:t>
+      </w:r>
+    </w:p>
+    <w:p/>
+    <w:p>
+      <w:r>
+        <w:rPr>
+          <w:rFonts w:ascii="Times New Roman" w:hAnsi="Times New Roman"/>
+          <w:sz w:val="24"/>
+        </w:rPr>
+        <w:t xml:space="preserve">This chapter presented the implementation and testing of Eve. It described the development environment, backend and frontend modules, interface screens, test plan, test results, AI evaluation approach, and discussion of results. The implementation confirms that the project topic was achieved through a working system for personalized learning, academic progress tracking, guided learning sessions, upload-assisted learning support, moderated peer notes, knowledge governance, and lecturer analytics.</w:t>
+      </w:r>
+    </w:p>
+    <w:p/>
+    <w:p>
+      <w:pPr>
+        <w:pStyle w:val="Heading1"/>
+      </w:pPr>
+      <w:r>
+        <w:rPr>
+          <w:b/>
+          <w:rFonts w:ascii="Times New Roman" w:hAnsi="Times New Roman"/>
+          <w:sz w:val="24"/>
+        </w:rPr>
+        <w:t xml:space="preserve">CHAPTER FIVE</w:t>
+      </w:r>
+    </w:p>
+    <w:p/>
+    <w:p>
+      <w:pPr>
+        <w:pStyle w:val="Heading1"/>
+      </w:pPr>
+      <w:r>
+        <w:rPr>
+          <w:b/>
+          <w:rFonts w:ascii="Times New Roman" w:hAnsi="Times New Roman"/>
+          <w:sz w:val="24"/>
+        </w:rPr>
+        <w:t xml:space="preserve">SUMMARY, CONCLUSION AND RECOMMENDATIONS</w:t>
+      </w:r>
+    </w:p>
+    <w:p/>
+    <w:p>
+      <w:pPr>
+        <w:pStyle w:val="Heading2"/>
+      </w:pPr>
+      <w:r>
+        <w:rPr>
+          <w:b/>
+          <w:rFonts w:ascii="Times New Roman" w:hAnsi="Times New Roman"/>
+          <w:sz w:val="24"/>
+        </w:rPr>
+        <w:t xml:space="preserve">5.1 Introduction to the Chapter</w:t>
+      </w:r>
+    </w:p>
+    <w:p/>
+    <w:p>
+      <w:r>
+        <w:rPr>
+          <w:rFonts w:ascii="Times New Roman" w:hAnsi="Times New Roman"/>
+          <w:sz w:val="24"/>
+        </w:rPr>
+        <w:t xml:space="preserve">This chapter presents the summary, conclusion, recommendations, limitations, future work, and AI-use disclosure for the project topic: Design and implementation of an ai system for personalized learning and academic progress tracking.</w:t>
+      </w:r>
+    </w:p>
+    <w:p/>
+    <w:p>
+      <w:r>
+        <w:rPr>
+          <w:rFonts w:ascii="Times New Roman" w:hAnsi="Times New Roman"/>
+          <w:sz w:val="24"/>
+        </w:rPr>
+        <w:t xml:space="preserve">The chapter reviews what was achieved in the study and explains how the implemented system addresses the identified problem.</w:t>
+      </w:r>
+    </w:p>
+    <w:p/>
+    <w:p>
+      <w:pPr>
+        <w:pStyle w:val="Heading2"/>
+      </w:pPr>
+      <w:r>
+        <w:rPr>
+          <w:b/>
+          <w:rFonts w:ascii="Times New Roman" w:hAnsi="Times New Roman"/>
+          <w:sz w:val="24"/>
+        </w:rPr>
+        <w:t xml:space="preserve">5.2 Summary of the Study</w:t>
+      </w:r>
+    </w:p>
+    <w:p/>
+    <w:p>
+      <w:r>
+        <w:rPr>
+          <w:rFonts w:ascii="Times New Roman" w:hAnsi="Times New Roman"/>
+          <w:sz w:val="24"/>
+        </w:rPr>
+        <w:t xml:space="preserve">The study focused on the design and implementation of an AI system that supports personalized learning and academic progress tracking for Edo State University Iyamho. The system, named Eve, was developed as a role-aware academic companion for prospective candidates, current students, and lecturers.</w:t>
+      </w:r>
+    </w:p>
+    <w:p/>
+    <w:p>
+      <w:r>
+        <w:rPr>
+          <w:rFonts w:ascii="Times New Roman" w:hAnsi="Times New Roman"/>
+          <w:sz w:val="24"/>
+        </w:rPr>
+        <w:t xml:space="preserve">The project began with the problem that academic guidance, course support, admission information, and progress tracking are often spread across different sources. Students may need support with weak topics, study planning, mock tests, and academic improvement, while lecturers may need course-level insights for teaching intervention. Generic AI chatbots are not sufficient because they may lack institutional grounding, privacy controls, and role-based access.</w:t>
+      </w:r>
+    </w:p>
+    <w:p/>
+    <w:p>
+      <w:r>
+        <w:rPr>
+          <w:rFonts w:ascii="Times New Roman" w:hAnsi="Times New Roman"/>
+          <w:sz w:val="24"/>
+        </w:rPr>
+        <w:t xml:space="preserve">To address the problem, Eve was built with a Flutter frontend and a Python FastAPI backend. The backend includes RAG retrieval, prompt-injection guardrails, role-based access control, student learning-profile computation, guided learning sessions, quiz scoring, SQLite progress persistence, lecturer assigned-course analytics, admission readiness estimation, upload-assisted questions, moderated peer-note contribution, knowledge governance, and optional OpenAI response generation.</w:t>
+      </w:r>
+    </w:p>
+    <w:p/>
+    <w:p>
+      <w:r>
+        <w:rPr>
+          <w:rFonts w:ascii="Times New Roman" w:hAnsi="Times New Roman"/>
+          <w:sz w:val="24"/>
+        </w:rPr>
+        <w:t xml:space="preserve">The implemented system demonstrates that AI can be used as an institutional academic-support layer when combined with verified knowledge, structured academic data, saved progress history, and privacy-aware controls.</w:t>
+      </w:r>
+    </w:p>
+    <w:p/>
+    <w:p>
+      <w:pPr>
+        <w:pStyle w:val="Heading2"/>
+      </w:pPr>
+      <w:r>
+        <w:rPr>
+          <w:b/>
+          <w:rFonts w:ascii="Times New Roman" w:hAnsi="Times New Roman"/>
+          <w:sz w:val="24"/>
+        </w:rPr>
+        <w:t xml:space="preserve">5.3 Achievement of Objectives</w:t>
+      </w:r>
+    </w:p>
+    <w:p/>
+    <w:p>
+      <w:r>
+        <w:rPr>
+          <w:rFonts w:ascii="Times New Roman" w:hAnsi="Times New Roman"/>
+          <w:sz w:val="24"/>
+        </w:rPr>
+        <w:t xml:space="preserve">The project objectives were achieved as follows:</w:t>
+      </w:r>
+    </w:p>
+    <w:p/>
+    <w:tbl>
+      <w:tblPr>
+        <w:tblW w:w="0" w:type="auto"/>
+        <w:tblBorders>
+          <w:top w:val="single" w:sz="4"/>
+          <w:left w:val="single" w:sz="4"/>
+          <w:bottom w:val="single" w:sz="4"/>
+          <w:right w:val="single" w:sz="4"/>
+          <w:insideH w:val="single" w:sz="4"/>
+          <w:insideV w:val="single" w:sz="4"/>
+        </w:tblBorders>
+      </w:tblPr>
+      <w:tr>
+        <w:tc>
+          <w:tcPr>
+            <w:tcW w:w="2400" w:type="dxa"/>
+          </w:tcPr>
+          <w:p>
+            <w:r>
+              <w:rPr>
+                <w:rFonts w:ascii="Times New Roman" w:hAnsi="Times New Roman"/>
+                <w:sz w:val="24"/>
+              </w:rPr>
+              <w:t xml:space="preserve">Objective</w:t>
+            </w:r>
+          </w:p>
+        </w:tc>
+        <w:tc>
+          <w:tcPr>
+            <w:tcW w:w="2400" w:type="dxa"/>
+          </w:tcPr>
+          <w:p>
+            <w:r>
+              <w:rPr>
+                <w:rFonts w:ascii="Times New Roman" w:hAnsi="Times New Roman"/>
+                <w:sz w:val="24"/>
+              </w:rPr>
+              <w:t xml:space="preserve">Achievement</w:t>
             </w:r>
           </w:p>
         </w:tc>
@@ -10349,21 +12107,21 @@
                 <w:rFonts w:ascii="Times New Roman" w:hAnsi="Times New Roman"/>
                 <w:sz w:val="24"/>
               </w:rPr>
-              <w:t xml:space="preserve">Add cybersecurity guardrails</w:t>
-            </w:r>
-          </w:p>
-        </w:tc>
-        <w:tc>
-          <w:tcPr>
-            <w:tcW w:w="2400" w:type="dxa"/>
-          </w:tcPr>
-          <w:p>
-            <w:r>
-              <w:rPr>
-                <w:rFonts w:ascii="Times New Roman" w:hAnsi="Times New Roman"/>
-                <w:sz w:val="24"/>
-              </w:rPr>
-              <w:t xml:space="preserve">Prompt injection, private-record extraction, and unauthorized requests are blocked.</w:t>
+              <w:t xml:space="preserve">Design a responsive AI system interface</w:t>
+            </w:r>
+          </w:p>
+        </w:tc>
+        <w:tc>
+          <w:tcPr>
+            <w:tcW w:w="2400" w:type="dxa"/>
+          </w:tcPr>
+          <w:p>
+            <w:r>
+              <w:rPr>
+                <w:rFonts w:ascii="Times New Roman" w:hAnsi="Times New Roman"/>
+                <w:sz w:val="24"/>
+              </w:rPr>
+              <w:t xml:space="preserve">A Flutter web/mobile interface was implemented with guest, student, lecturer, chat, tools, admission, and profile screens.</w:t>
             </w:r>
           </w:p>
         </w:tc>
@@ -10379,21 +12137,21 @@
                 <w:rFonts w:ascii="Times New Roman" w:hAnsi="Times New Roman"/>
                 <w:sz w:val="24"/>
               </w:rPr>
-              <w:t xml:space="preserve">Provide student academic advising and mock assessment support</w:t>
-            </w:r>
-          </w:p>
-        </w:tc>
-        <w:tc>
-          <w:tcPr>
-            <w:tcW w:w="2400" w:type="dxa"/>
-          </w:tcPr>
-          <w:p>
-            <w:r>
-              <w:rPr>
-                <w:rFonts w:ascii="Times New Roman" w:hAnsi="Times New Roman"/>
-                <w:sz w:val="24"/>
-              </w:rPr>
-              <w:t xml:space="preserve">Eve supports course explanations, mock questions, guided sessions, scoring, and feedback.</w:t>
+              <w:t xml:space="preserve">Implement personalized academic support for students</w:t>
+            </w:r>
+          </w:p>
+        </w:tc>
+        <w:tc>
+          <w:tcPr>
+            <w:tcW w:w="2400" w:type="dxa"/>
+          </w:tcPr>
+          <w:p>
+            <w:r>
+              <w:rPr>
+                <w:rFonts w:ascii="Times New Roman" w:hAnsi="Times New Roman"/>
+                <w:sz w:val="24"/>
+              </w:rPr>
+              <w:t xml:space="preserve">The student module analyzes course records, weak topics, risk levels, timetable data, and saved quiz performance.</w:t>
             </w:r>
           </w:p>
         </w:tc>
@@ -10409,21 +12167,21 @@
                 <w:rFonts w:ascii="Times New Roman" w:hAnsi="Times New Roman"/>
                 <w:sz w:val="24"/>
               </w:rPr>
-              <w:t xml:space="preserve">Provide lecturer analytics</w:t>
-            </w:r>
-          </w:p>
-        </w:tc>
-        <w:tc>
-          <w:tcPr>
-            <w:tcW w:w="2400" w:type="dxa"/>
-          </w:tcPr>
-          <w:p>
-            <w:r>
-              <w:rPr>
-                <w:rFonts w:ascii="Times New Roman" w:hAnsi="Times New Roman"/>
-                <w:sz w:val="24"/>
-              </w:rPr>
-              <w:t xml:space="preserve">Lecturers can view assigned-course analytics and saved learning-session trends.</w:t>
+              <w:t xml:space="preserve">Implement academic progress tracking</w:t>
+            </w:r>
+          </w:p>
+        </w:tc>
+        <w:tc>
+          <w:tcPr>
+            <w:tcW w:w="2400" w:type="dxa"/>
+          </w:tcPr>
+          <w:p>
+            <w:r>
+              <w:rPr>
+                <w:rFonts w:ascii="Times New Roman" w:hAnsi="Times New Roman"/>
+                <w:sz w:val="24"/>
+              </w:rPr>
+              <w:t xml:space="preserve">Eve tracks overall progress, priority course, weak topics, completed learning sessions, quiz scores, and feedback history.</w:t>
             </w:r>
           </w:p>
         </w:tc>
@@ -10439,21 +12197,21 @@
                 <w:rFonts w:ascii="Times New Roman" w:hAnsi="Times New Roman"/>
                 <w:sz w:val="24"/>
               </w:rPr>
-              <w:t xml:space="preserve">Include admission readiness guidance</w:t>
-            </w:r>
-          </w:p>
-        </w:tc>
-        <w:tc>
-          <w:tcPr>
-            <w:tcW w:w="2400" w:type="dxa"/>
-          </w:tcPr>
-          <w:p>
-            <w:r>
-              <w:rPr>
-                <w:rFonts w:ascii="Times New Roman" w:hAnsi="Times New Roman"/>
-                <w:sz w:val="24"/>
-              </w:rPr>
-              <w:t xml:space="preserve">The guest module includes a readiness estimator based on JAMB and O-Level details.</w:t>
+              <w:t xml:space="preserve">Generate personalized learning plans</w:t>
+            </w:r>
+          </w:p>
+        </w:tc>
+        <w:tc>
+          <w:tcPr>
+            <w:tcW w:w="2400" w:type="dxa"/>
+          </w:tcPr>
+          <w:p>
+            <w:r>
+              <w:rPr>
+                <w:rFonts w:ascii="Times New Roman" w:hAnsi="Times New Roman"/>
+                <w:sz w:val="24"/>
+              </w:rPr>
+              <w:t xml:space="preserve">The system recommends weekly learning tasks, priority-course sessions, and study milestones.</w:t>
             </w:r>
           </w:p>
         </w:tc>
@@ -10469,6 +12227,276 @@
                 <w:rFonts w:ascii="Times New Roman" w:hAnsi="Times New Roman"/>
                 <w:sz w:val="24"/>
               </w:rPr>
+              <w:t xml:space="preserve">Implement RAG with ESUI knowledge</w:t>
+            </w:r>
+          </w:p>
+        </w:tc>
+        <w:tc>
+          <w:tcPr>
+            <w:tcW w:w="2400" w:type="dxa"/>
+          </w:tcPr>
+          <w:p>
+            <w:r>
+              <w:rPr>
+                <w:rFonts w:ascii="Times New Roman" w:hAnsi="Times New Roman"/>
+                <w:sz w:val="24"/>
+              </w:rPr>
+              <w:t xml:space="preserve">The backend retrieves from a curated ESUI knowledge base and grounds public responses in approved context.</w:t>
+            </w:r>
+          </w:p>
+        </w:tc>
+      </w:tr>
+      <w:tr>
+        <w:tc>
+          <w:tcPr>
+            <w:tcW w:w="2400" w:type="dxa"/>
+          </w:tcPr>
+          <w:p>
+            <w:r>
+              <w:rPr>
+                <w:rFonts w:ascii="Times New Roman" w:hAnsi="Times New Roman"/>
+                <w:sz w:val="24"/>
+              </w:rPr>
+              <w:t xml:space="preserve">Implement role-based access control</w:t>
+            </w:r>
+          </w:p>
+        </w:tc>
+        <w:tc>
+          <w:tcPr>
+            <w:tcW w:w="2400" w:type="dxa"/>
+          </w:tcPr>
+          <w:p>
+            <w:r>
+              <w:rPr>
+                <w:rFonts w:ascii="Times New Roman" w:hAnsi="Times New Roman"/>
+                <w:sz w:val="24"/>
+              </w:rPr>
+              <w:t xml:space="preserve">Guests, students, and lecturers receive different authorized data access.</w:t>
+            </w:r>
+          </w:p>
+        </w:tc>
+      </w:tr>
+      <w:tr>
+        <w:tc>
+          <w:tcPr>
+            <w:tcW w:w="2400" w:type="dxa"/>
+          </w:tcPr>
+          <w:p>
+            <w:r>
+              <w:rPr>
+                <w:rFonts w:ascii="Times New Roman" w:hAnsi="Times New Roman"/>
+                <w:sz w:val="24"/>
+              </w:rPr>
+              <w:t xml:space="preserve">Add cybersecurity guardrails</w:t>
+            </w:r>
+          </w:p>
+        </w:tc>
+        <w:tc>
+          <w:tcPr>
+            <w:tcW w:w="2400" w:type="dxa"/>
+          </w:tcPr>
+          <w:p>
+            <w:r>
+              <w:rPr>
+                <w:rFonts w:ascii="Times New Roman" w:hAnsi="Times New Roman"/>
+                <w:sz w:val="24"/>
+              </w:rPr>
+              <w:t xml:space="preserve">Prompt injection, private-record extraction, and unauthorized requests are blocked.</w:t>
+            </w:r>
+          </w:p>
+        </w:tc>
+      </w:tr>
+      <w:tr>
+        <w:tc>
+          <w:tcPr>
+            <w:tcW w:w="2400" w:type="dxa"/>
+          </w:tcPr>
+          <w:p>
+            <w:r>
+              <w:rPr>
+                <w:rFonts w:ascii="Times New Roman" w:hAnsi="Times New Roman"/>
+                <w:sz w:val="24"/>
+              </w:rPr>
+              <w:t xml:space="preserve">Provide student academic advising and mock assessment support</w:t>
+            </w:r>
+          </w:p>
+        </w:tc>
+        <w:tc>
+          <w:tcPr>
+            <w:tcW w:w="2400" w:type="dxa"/>
+          </w:tcPr>
+          <w:p>
+            <w:r>
+              <w:rPr>
+                <w:rFonts w:ascii="Times New Roman" w:hAnsi="Times New Roman"/>
+                <w:sz w:val="24"/>
+              </w:rPr>
+              <w:t xml:space="preserve">Eve supports course explanations, mock questions, guided sessions, scoring, and feedback.</w:t>
+            </w:r>
+          </w:p>
+        </w:tc>
+      </w:tr>
+      <w:tr>
+        <w:tc>
+          <w:tcPr>
+            <w:tcW w:w="2400" w:type="dxa"/>
+          </w:tcPr>
+          <w:p>
+            <w:r>
+              <w:rPr>
+                <w:rFonts w:ascii="Times New Roman" w:hAnsi="Times New Roman"/>
+                <w:sz w:val="24"/>
+              </w:rPr>
+              <w:t xml:space="preserve">Provide lecturer analytics</w:t>
+            </w:r>
+          </w:p>
+        </w:tc>
+        <w:tc>
+          <w:tcPr>
+            <w:tcW w:w="2400" w:type="dxa"/>
+          </w:tcPr>
+          <w:p>
+            <w:r>
+              <w:rPr>
+                <w:rFonts w:ascii="Times New Roman" w:hAnsi="Times New Roman"/>
+                <w:sz w:val="24"/>
+              </w:rPr>
+              <w:t xml:space="preserve">Lecturers can view assigned-course analytics and saved learning-session trends.</w:t>
+            </w:r>
+          </w:p>
+        </w:tc>
+      </w:tr>
+      <w:tr>
+        <w:tc>
+          <w:tcPr>
+            <w:tcW w:w="2400" w:type="dxa"/>
+          </w:tcPr>
+          <w:p>
+            <w:r>
+              <w:rPr>
+                <w:rFonts w:ascii="Times New Roman" w:hAnsi="Times New Roman"/>
+                <w:sz w:val="24"/>
+              </w:rPr>
+              <w:t xml:space="preserve">Include admission readiness guidance</w:t>
+            </w:r>
+          </w:p>
+        </w:tc>
+        <w:tc>
+          <w:tcPr>
+            <w:tcW w:w="2400" w:type="dxa"/>
+          </w:tcPr>
+          <w:p>
+            <w:r>
+              <w:rPr>
+                <w:rFonts w:ascii="Times New Roman" w:hAnsi="Times New Roman"/>
+                <w:sz w:val="24"/>
+              </w:rPr>
+              <w:t xml:space="preserve">The guest module includes a readiness estimator based on JAMB and O-Level details.</w:t>
+            </w:r>
+          </w:p>
+        </w:tc>
+      </w:tr>
+      <w:tr>
+        <w:tc>
+          <w:tcPr>
+            <w:tcW w:w="2400" w:type="dxa"/>
+          </w:tcPr>
+          <w:p>
+            <w:r>
+              <w:rPr>
+                <w:rFonts w:ascii="Times New Roman" w:hAnsi="Times New Roman"/>
+                <w:sz w:val="24"/>
+              </w:rPr>
+              <w:t xml:space="preserve">Support student learning-material uploads</w:t>
+            </w:r>
+          </w:p>
+        </w:tc>
+        <w:tc>
+          <w:tcPr>
+            <w:tcW w:w="2400" w:type="dxa"/>
+          </w:tcPr>
+          <w:p>
+            <w:r>
+              <w:rPr>
+                <w:rFonts w:ascii="Times New Roman" w:hAnsi="Times New Roman"/>
+                <w:sz w:val="24"/>
+              </w:rPr>
+              <w:t xml:space="preserve">Students can upload notes for private Ask Eve context during a learning conversation.</w:t>
+            </w:r>
+          </w:p>
+        </w:tc>
+      </w:tr>
+      <w:tr>
+        <w:tc>
+          <w:tcPr>
+            <w:tcW w:w="2400" w:type="dxa"/>
+          </w:tcPr>
+          <w:p>
+            <w:r>
+              <w:rPr>
+                <w:rFonts w:ascii="Times New Roman" w:hAnsi="Times New Roman"/>
+                <w:sz w:val="24"/>
+              </w:rPr>
+              <w:t xml:space="preserve">Support peer learning with moderation</w:t>
+            </w:r>
+          </w:p>
+        </w:tc>
+        <w:tc>
+          <w:tcPr>
+            <w:tcW w:w="2400" w:type="dxa"/>
+          </w:tcPr>
+          <w:p>
+            <w:r>
+              <w:rPr>
+                <w:rFonts w:ascii="Times New Roman" w:hAnsi="Times New Roman"/>
+                <w:sz w:val="24"/>
+              </w:rPr>
+              <w:t xml:space="preserve">Students can submit course notes, while lecturers or administrators review them before shared use.</w:t>
+            </w:r>
+          </w:p>
+        </w:tc>
+      </w:tr>
+      <w:tr>
+        <w:tc>
+          <w:tcPr>
+            <w:tcW w:w="2400" w:type="dxa"/>
+          </w:tcPr>
+          <w:p>
+            <w:r>
+              <w:rPr>
+                <w:rFonts w:ascii="Times New Roman" w:hAnsi="Times New Roman"/>
+                <w:sz w:val="24"/>
+              </w:rPr>
+              <w:t xml:space="preserve">Support knowledge governance</w:t>
+            </w:r>
+          </w:p>
+        </w:tc>
+        <w:tc>
+          <w:tcPr>
+            <w:tcW w:w="2400" w:type="dxa"/>
+          </w:tcPr>
+          <w:p>
+            <w:r>
+              <w:rPr>
+                <w:rFonts w:ascii="Times New Roman" w:hAnsi="Times New Roman"/>
+                <w:sz w:val="24"/>
+              </w:rPr>
+              <w:t xml:space="preserve">Admin knowledge tools and audit-style labels help separate curated knowledge from unverified content.</w:t>
+            </w:r>
+          </w:p>
+        </w:tc>
+      </w:tr>
+      <w:tr>
+        <w:tc>
+          <w:tcPr>
+            <w:tcW w:w="2400" w:type="dxa"/>
+          </w:tcPr>
+          <w:p>
+            <w:r>
+              <w:rPr>
+                <w:rFonts w:ascii="Times New Roman" w:hAnsi="Times New Roman"/>
+                <w:sz w:val="24"/>
+              </w:rPr>
               <w:t xml:space="preserve">Evaluate the system</w:t>
             </w:r>
           </w:p>
@@ -10565,6 +12593,24 @@
           <w:rFonts w:ascii="Times New Roman" w:hAnsi="Times New Roman"/>
           <w:sz w:val="24"/>
         </w:rPr>
+        <w:t xml:space="preserve">• It demonstrates a moderated peer-learning workflow where student contributions are reviewed before being reused.</w:t>
+      </w:r>
+    </w:p>
+    <w:p>
+      <w:r>
+        <w:rPr>
+          <w:rFonts w:ascii="Times New Roman" w:hAnsi="Times New Roman"/>
+          <w:sz w:val="24"/>
+        </w:rPr>
+        <w:t xml:space="preserve">• It shows how uploaded notes can support a student's private learning question without polluting the shared knowledge base.</w:t>
+      </w:r>
+    </w:p>
+    <w:p>
+      <w:r>
+        <w:rPr>
+          <w:rFonts w:ascii="Times New Roman" w:hAnsi="Times New Roman"/>
+          <w:sz w:val="24"/>
+        </w:rPr>
         <w:t xml:space="preserve">• It shows how prompt-injection guardrails can be included in an educational AI prototype.</w:t>
       </w:r>
     </w:p>
@@ -10608,7 +12654,7 @@
           <w:rFonts w:ascii="Times New Roman" w:hAnsi="Times New Roman"/>
           <w:sz w:val="24"/>
         </w:rPr>
-        <w:t xml:space="preserve">The student module identifies weak topics, recommends study tasks, starts guided learning sessions, scores answers, provides feedback, and saves progress history. The lecturer module provides assigned-course analytics and uses saved learning-session data to suggest teaching interventions. The guest module supports admissions guidance and public inquiries. The system also includes RAG, OpenAI response generation, local fallback logic, prompt-injection guardrails, and SQLite persistence.</w:t>
+        <w:t xml:space="preserve">The student module identifies weak topics, recommends study tasks, starts guided learning sessions, scores answers, provides feedback, saves progress history, and supports note-assisted questions. The lecturer module provides assigned-course analytics, uses saved learning-session data to suggest teaching interventions, and reviews peer notes for assigned courses. The guest module supports admissions guidance and public inquiries. The system also includes RAG, OpenAI response generation, local fallback logic, prompt-injection guardrails, knowledge governance, and SQLite persistence.</w:t>
       </w:r>
     </w:p>
     <w:p/>
@@ -10697,6 +12743,24 @@
           <w:rFonts w:ascii="Times New Roman" w:hAnsi="Times New Roman"/>
           <w:sz w:val="24"/>
         </w:rPr>
+        <w:t xml:space="preserve">• The peer-note workflow uses prototype moderation records and should be connected to official lecturer accounts before production use.</w:t>
+      </w:r>
+    </w:p>
+    <w:p>
+      <w:r>
+        <w:rPr>
+          <w:rFonts w:ascii="Times New Roman" w:hAnsi="Times New Roman"/>
+          <w:sz w:val="24"/>
+        </w:rPr>
+        <w:t xml:space="preserve">• Uploaded files are used for demonstration and should be scanned, stored, and governed with stronger institutional controls in production.</w:t>
+      </w:r>
+    </w:p>
+    <w:p>
+      <w:r>
+        <w:rPr>
+          <w:rFonts w:ascii="Times New Roman" w:hAnsi="Times New Roman"/>
+          <w:sz w:val="24"/>
+        </w:rPr>
         <w:t xml:space="preserve">• OpenAI response quality depends on API availability and configuration.</w:t>
       </w:r>
     </w:p>
@@ -10786,6 +12850,15 @@
           <w:sz w:val="24"/>
         </w:rPr>
         <w:t xml:space="preserve">• Course materials should be added through lecturer-approved LMS integration.</w:t>
+      </w:r>
+    </w:p>
+    <w:p>
+      <w:r>
+        <w:rPr>
+          <w:rFonts w:ascii="Times New Roman" w:hAnsi="Times New Roman"/>
+          <w:sz w:val="24"/>
+        </w:rPr>
+        <w:t xml:space="preserve">• Peer-learning submissions should remain hidden from general use until approved by authorized lecturers or administrators.</w:t>
       </w:r>
     </w:p>
     <w:p>

</xml_diff>